<commit_message>
docs: add cover date to papers and document verification.md in README
</commit_message>
<xml_diff>
--- a/docs/FIDO2_PoP_Gateway.docx
+++ b/docs/FIDO2_PoP_Gateway.docx
@@ -47,6 +47,19 @@
         <w:t>강아름</w:t>
       </w:r>
       <w:proofErr w:type="spellEnd"/>
+    </w:p>
+    <w:p>
+      <w:pPr>
+        <w:pStyle w:val="3"/>
+        <w:jc w:val="right"/>
+      </w:pPr>
+      <w:r>
+        <w:rPr>
+          <w:rFonts w:ascii="KoPub돋움체 Light" w:hAnsi="KoPub돋움체 Light"/>
+          <w:sz w:val="24"/>
+        </w:rPr>
+        <w:t>2026년 9월 8일</w:t>
+      </w:r>
     </w:p>
     <w:p>
       <w:pPr>

</xml_diff>

<commit_message>
docs: add proper cover page to both KO and EN DOCX files
</commit_message>
<xml_diff>
--- a/docs/FIDO2_PoP_Gateway.docx
+++ b/docs/FIDO2_PoP_Gateway.docx
@@ -4,62 +4,215 @@
   <w:body>
     <w:p>
       <w:pPr>
-        <w:pStyle w:val="1"/>
-        <w:spacing w:before="0"/>
+        <w:spacing w:before="2400" w:after="0"/>
+      </w:pPr>
+    </w:p>
+    <w:p>
+      <w:pPr>
         <w:jc w:val="center"/>
-        <w:rPr>
-          <w:rFonts w:ascii="KoPub돋움체 Light" w:eastAsia="KoPub돋움체 Light" w:hAnsi="KoPub돋움체 Light" w:hint="eastAsia"/>
-        </w:rPr>
-      </w:pPr>
-      <w:r>
-        <w:rPr>
-          <w:rFonts w:ascii="KoPub돋움체 Light" w:eastAsia="KoPub돋움체 Light" w:hAnsi="KoPub돋움체 Light" w:cs="Arial Unicode MS"/>
-        </w:rPr>
-        <w:t>FIDO2 하드웨어 격리 키 기반 Proof-of-Possession 역방향 프록시 게이트웨이의 설계 및 성능 분석</w:t>
-      </w:r>
-      <w:bookmarkStart w:id="0" w:name="_rkm2jy2l55l" w:colFirst="0" w:colLast="0"/>
-      <w:bookmarkEnd w:id="0"/>
+        <w:spacing w:before="0" w:after="280"/>
+      </w:pPr>
+      <w:r>
+        <w:rPr>
+          <w:rFonts w:eastAsia="맑은 고딕" w:ascii="Calibri"/>
+          <w:b/>
+          <w:sz w:val="44"/>
+          <w:szCs w:val="44"/>
+          <w:color w:val="1E3A5F"/>
+        </w:rPr>
+        <w:t xml:space="preserve">FIDO2 하드웨어 격리 키 기반
+Proof-of-Possession 역방향 프록시 게이트웨이의
+설계 및 성능 분석</w:t>
+      </w:r>
+    </w:p>
+    <w:p>
+      <w:pPr>
+        <w:pBdr>
+          <w:bottom w:val="single" w:sz="6" w:space="1" w:color="2563EB"/>
+        </w:pBdr>
+      </w:pPr>
+    </w:p>
+    <w:p>
+      <w:pPr>
+        <w:spacing w:before="480" w:after="0"/>
+      </w:pPr>
+    </w:p>
+    <w:p>
+      <w:pPr>
+        <w:jc w:val="center"/>
+        <w:spacing w:before="0" w:after="400"/>
+      </w:pPr>
+      <w:r>
+        <w:rPr>
+          <w:rFonts w:eastAsia="맑은 고딕" w:ascii="Calibri"/>
+          <w:sz w:val="26"/>
+          <w:szCs w:val="26"/>
+          <w:color w:val="4B5563"/>
+        </w:rPr>
+        <w:t xml:space="preserve">웹 API 보안 및 하드웨어 암호 기반 인증 프로토콜</w:t>
+      </w:r>
+    </w:p>
+    <w:p>
+      <w:pPr>
+        <w:spacing w:before="800" w:after="0"/>
+      </w:pPr>
+    </w:p>
+    <w:p>
+      <w:pPr>
+        <w:jc w:val="center"/>
+        <w:spacing w:before="0" w:after="0"/>
+      </w:pPr>
+      <w:r>
+        <w:rPr>
+          <w:rFonts w:eastAsia="맑은 고딕" w:ascii="Calibri"/>
+          <w:b/>
+          <w:sz w:val="28"/>
+          <w:szCs w:val="28"/>
+          <w:color w:val="1E3A5F"/>
+        </w:rPr>
+        <w:t xml:space="preserve">작성자: 강아름</w:t>
+      </w:r>
+    </w:p>
+    <w:p>
+      <w:pPr>
+        <w:spacing w:before="160" w:after="0"/>
+      </w:pPr>
+    </w:p>
+    <w:p>
+      <w:pPr>
+        <w:jc w:val="center"/>
+        <w:spacing w:before="0" w:after="0"/>
+      </w:pPr>
+      <w:r>
+        <w:rPr>
+          <w:rFonts w:eastAsia="맑은 고딕" w:ascii="Calibri"/>
+          <w:sz w:val="26"/>
+          <w:szCs w:val="26"/>
+          <w:color w:val="374151"/>
+        </w:rPr>
+        <w:t xml:space="preserve">작성일: 2026년 9월 8일</w:t>
+      </w:r>
+    </w:p>
+    <w:p>
+      <w:r>
+        <w:br w:type="page"/>
+      </w:r>
     </w:p>
     <w:p>
       <w:pPr>
         <w:pStyle w:val="3"/>
         <w:spacing w:before="0"/>
-        <w:jc w:val="right"/>
-        <w:rPr>
-          <w:rFonts w:ascii="KoPub돋움체 Light" w:eastAsia="KoPub돋움체 Light" w:hAnsi="KoPub돋움체 Light" w:hint="eastAsia"/>
-          <w:b w:val="0"/>
-          <w:bCs w:val="0"/>
-          <w:sz w:val="24"/>
-          <w:szCs w:val="24"/>
-        </w:rPr>
-      </w:pPr>
-      <w:bookmarkStart w:id="1" w:name="_nsuh13r56hdd" w:colFirst="0" w:colLast="0"/>
-      <w:bookmarkEnd w:id="1"/>
+        <w:rPr>
+          <w:rFonts w:ascii="KoPub돋움체 Light" w:eastAsia="KoPub돋움체 Light" w:hAnsi="KoPub돋움체 Light" w:cs="Arial Unicode MS"/>
+        </w:rPr>
+      </w:pPr>
+      <w:bookmarkStart w:id="2" w:name="_jp5mp33j64xx" w:colFirst="0" w:colLast="0"/>
+      <w:bookmarkEnd w:id="2"/>
+      <w:r>
+        <w:rPr>
+          <w:rFonts w:ascii="KoPub돋움체 Light" w:eastAsia="KoPub돋움체 Light" w:hAnsi="KoPub돋움체 Light" w:cs="Arial Unicode MS"/>
+        </w:rPr>
+        <w:t>초록</w:t>
+      </w:r>
+    </w:p>
+    <w:p/>
+    <w:p>
+      <w:pPr>
+        <w:rPr>
+          <w:rFonts w:ascii="KoPub돋움체 Light" w:eastAsia="KoPub돋움체 Light" w:hAnsi="KoPub돋움체 Light"/>
+        </w:rPr>
+      </w:pPr>
+      <w:r>
+        <w:rPr>
+          <w:rFonts w:ascii="KoPub돋움체 Light" w:eastAsia="KoPub돋움체 Light" w:hAnsi="KoPub돋움체 Light" w:cs="Arial Unicode MS"/>
+        </w:rPr>
+        <w:tab/>
+        <w:t>소지자 토큰(Bearer Token)과 소프트웨어 기반 소유권 증명(</w:t>
+      </w:r>
       <w:proofErr w:type="spellStart"/>
       <w:r>
         <w:rPr>
           <w:rFonts w:ascii="KoPub돋움체 Light" w:eastAsia="KoPub돋움체 Light" w:hAnsi="KoPub돋움체 Light" w:cs="Arial Unicode MS"/>
-          <w:b w:val="0"/>
-          <w:bCs w:val="0"/>
-          <w:sz w:val="24"/>
-          <w:szCs w:val="24"/>
-        </w:rPr>
-        <w:t>강아름</w:t>
+        </w:rPr>
+        <w:t>DPoP</w:t>
       </w:r>
       <w:proofErr w:type="spellEnd"/>
-    </w:p>
-    <w:p>
-      <w:pPr>
-        <w:pStyle w:val="3"/>
-        <w:jc w:val="right"/>
-      </w:pPr>
-      <w:r>
-        <w:rPr>
-          <w:rFonts w:ascii="KoPub돋움체 Light" w:hAnsi="KoPub돋움체 Light"/>
-          <w:sz w:val="24"/>
-        </w:rPr>
-        <w:t>2026년 9월 8일</w:t>
-      </w:r>
+      <w:r>
+        <w:rPr>
+          <w:rFonts w:ascii="KoPub돋움체 Light" w:eastAsia="KoPub돋움체 Light" w:hAnsi="KoPub돋움체 Light" w:cs="Arial Unicode MS"/>
+        </w:rPr>
+        <w:t xml:space="preserve">) 규격은 토큰 탈취나 런타임 메모리 침해 환경에서 개인키 유출과 세션 </w:t>
+      </w:r>
+      <w:proofErr w:type="spellStart"/>
+      <w:r>
+        <w:rPr>
+          <w:rFonts w:ascii="KoPub돋움체 Light" w:eastAsia="KoPub돋움체 Light" w:hAnsi="KoPub돋움체 Light" w:cs="Arial Unicode MS"/>
+        </w:rPr>
+        <w:t>하이재킹을</w:t>
+      </w:r>
+      <w:proofErr w:type="spellEnd"/>
+      <w:r>
+        <w:rPr>
+          <w:rFonts w:ascii="KoPub돋움체 Light" w:eastAsia="KoPub돋움체 Light" w:hAnsi="KoPub돋움체 Light" w:cs="Arial Unicode MS"/>
+        </w:rPr>
+        <w:t xml:space="preserve"> 근본적으로 방어하지 못한다. 본 연구에서는 하드웨어 보안 칩셋에 개인키를 물리적으로 격리하는 FIDO2 규격을 L7 역방향 프록시와 결합한 Proof-of-Possession(</w:t>
+      </w:r>
+      <w:proofErr w:type="spellStart"/>
+      <w:r>
+        <w:rPr>
+          <w:rFonts w:ascii="KoPub돋움체 Light" w:eastAsia="KoPub돋움체 Light" w:hAnsi="KoPub돋움체 Light" w:cs="Arial Unicode MS"/>
+        </w:rPr>
+        <w:t>PoP</w:t>
+      </w:r>
+      <w:proofErr w:type="spellEnd"/>
+      <w:r>
+        <w:rPr>
+          <w:rFonts w:ascii="KoPub돋움체 Light" w:eastAsia="KoPub돋움체 Light" w:hAnsi="KoPub돋움체 Light" w:cs="Arial Unicode MS"/>
+        </w:rPr>
+        <w:t xml:space="preserve">) 게이트웨이 아키텍처를 제안한다.  </w:t>
+      </w:r>
+    </w:p>
+    <w:p>
+      <w:pPr>
+        <w:rPr>
+          <w:rFonts w:ascii="KoPub돋움체 Light" w:eastAsia="KoPub돋움체 Light" w:hAnsi="KoPub돋움체 Light"/>
+        </w:rPr>
+      </w:pPr>
+    </w:p>
+    <w:p>
+      <w:pPr>
+        <w:ind w:firstLineChars="100" w:firstLine="198"/>
+        <w:rPr>
+          <w:rFonts w:ascii="KoPub돋움체 Light" w:eastAsia="KoPub돋움체 Light" w:hAnsi="KoPub돋움체 Light"/>
+        </w:rPr>
+      </w:pPr>
+      <w:r>
+        <w:rPr>
+          <w:rFonts w:ascii="KoPub돋움체 Light" w:eastAsia="KoPub돋움체 Light" w:hAnsi="KoPub돋움체 Light" w:cs="Arial Unicode MS"/>
+        </w:rPr>
+        <w:t xml:space="preserve">제안 시스템은 대용량 페이로드의 메모리 부하를 방지하기 위해 스트리밍 다이제스트 파이프라인으로 요청을 정규화하고, 비인가 대량 트래픽 차단을 위해 시간 복잡도 O(1)의 슬라이딩 윈도우 </w:t>
+      </w:r>
+      <w:proofErr w:type="spellStart"/>
+      <w:r>
+        <w:rPr>
+          <w:rFonts w:ascii="KoPub돋움체 Light" w:eastAsia="KoPub돋움체 Light" w:hAnsi="KoPub돋움체 Light" w:cs="Arial Unicode MS"/>
+        </w:rPr>
+        <w:t>인그레스</w:t>
+      </w:r>
+      <w:proofErr w:type="spellEnd"/>
+      <w:r>
+        <w:rPr>
+          <w:rFonts w:ascii="KoPub돋움체 Light" w:eastAsia="KoPub돋움체 Light" w:hAnsi="KoPub돋움체 Light" w:cs="Arial Unicode MS"/>
+        </w:rPr>
+        <w:t xml:space="preserve"> 제어 메커니즘을 적용하였다. 또한 타원곡선 서명 검증을 비동기 스레드 풀로 위임하여 단일 노드의 동시 접속 처리 성능을 극대화하였다. 성능 평가 결과, 제안하는 ECDSA P-256 서명 바인딩은 표준 토큰 검증 대비 지연시간 오버헤드를 평균 +25.65 %로 억제하였으며, RSA-2048 대비 HTTP 헤더 페이로드를 50 % 절감하였다. 아울러 동시성 최적화를 통해 100명의 가상 유저 부하 환경에서도 초당 780건의 처리량(RPS)을 달성하여 고부하 트래픽에 대한 방어 실효성과 실무 적용 타당성을 입증하였다.</w:t>
+      </w:r>
+    </w:p>
+    <w:p>
+      <w:pPr>
+        <w:rPr>
+          <w:rFonts w:ascii="KoPub돋움체 Light" w:eastAsia="KoPub돋움체 Light" w:hAnsi="KoPub돋움체 Light"/>
+        </w:rPr>
+      </w:pPr>
     </w:p>
     <w:p>
       <w:pPr>
@@ -69,128 +222,6 @@
           <w:rFonts w:ascii="KoPub돋움체 Light" w:eastAsia="KoPub돋움체 Light" w:hAnsi="KoPub돋움체 Light" w:cs="Arial Unicode MS"/>
         </w:rPr>
       </w:pPr>
-      <w:bookmarkStart w:id="2" w:name="_jp5mp33j64xx" w:colFirst="0" w:colLast="0"/>
-      <w:bookmarkEnd w:id="2"/>
-      <w:r>
-        <w:rPr>
-          <w:rFonts w:ascii="KoPub돋움체 Light" w:eastAsia="KoPub돋움체 Light" w:hAnsi="KoPub돋움체 Light" w:cs="Arial Unicode MS"/>
-        </w:rPr>
-        <w:t>초록</w:t>
-      </w:r>
-    </w:p>
-    <w:p>
-      <w:pPr>
-        <w:rPr>
-          <w:rFonts w:hint="eastAsia"/>
-        </w:rPr>
-      </w:pPr>
-    </w:p>
-    <w:p>
-      <w:pPr>
-        <w:rPr>
-          <w:rFonts w:ascii="KoPub돋움체 Light" w:eastAsia="KoPub돋움체 Light" w:hAnsi="KoPub돋움체 Light"/>
-        </w:rPr>
-      </w:pPr>
-      <w:r>
-        <w:rPr>
-          <w:rFonts w:ascii="KoPub돋움체 Light" w:eastAsia="KoPub돋움체 Light" w:hAnsi="KoPub돋움체 Light" w:cs="Arial Unicode MS"/>
-        </w:rPr>
-        <w:tab/>
-        <w:t>소지자 토큰(Bearer Token)과 소프트웨어 기반 소유권 증명(</w:t>
-      </w:r>
-      <w:proofErr w:type="spellStart"/>
-      <w:r>
-        <w:rPr>
-          <w:rFonts w:ascii="KoPub돋움체 Light" w:eastAsia="KoPub돋움체 Light" w:hAnsi="KoPub돋움체 Light" w:cs="Arial Unicode MS"/>
-        </w:rPr>
-        <w:t>DPoP</w:t>
-      </w:r>
-      <w:proofErr w:type="spellEnd"/>
-      <w:r>
-        <w:rPr>
-          <w:rFonts w:ascii="KoPub돋움체 Light" w:eastAsia="KoPub돋움체 Light" w:hAnsi="KoPub돋움체 Light" w:cs="Arial Unicode MS"/>
-        </w:rPr>
-        <w:t xml:space="preserve">) 규격은 토큰 탈취나 런타임 메모리 침해 환경에서 개인키 유출과 세션 </w:t>
-      </w:r>
-      <w:proofErr w:type="spellStart"/>
-      <w:r>
-        <w:rPr>
-          <w:rFonts w:ascii="KoPub돋움체 Light" w:eastAsia="KoPub돋움체 Light" w:hAnsi="KoPub돋움체 Light" w:cs="Arial Unicode MS"/>
-        </w:rPr>
-        <w:t>하이재킹을</w:t>
-      </w:r>
-      <w:proofErr w:type="spellEnd"/>
-      <w:r>
-        <w:rPr>
-          <w:rFonts w:ascii="KoPub돋움체 Light" w:eastAsia="KoPub돋움체 Light" w:hAnsi="KoPub돋움체 Light" w:cs="Arial Unicode MS"/>
-        </w:rPr>
-        <w:t xml:space="preserve"> 근본적으로 방어하지 못한다. 본 연구에서는 하드웨어 보안 칩셋에 개인키를 물리적으로 격리하는 FIDO2 규격을 L7 역방향 프록시와 결합한 Proof-of-Possession(</w:t>
-      </w:r>
-      <w:proofErr w:type="spellStart"/>
-      <w:r>
-        <w:rPr>
-          <w:rFonts w:ascii="KoPub돋움체 Light" w:eastAsia="KoPub돋움체 Light" w:hAnsi="KoPub돋움체 Light" w:cs="Arial Unicode MS"/>
-        </w:rPr>
-        <w:t>PoP</w:t>
-      </w:r>
-      <w:proofErr w:type="spellEnd"/>
-      <w:r>
-        <w:rPr>
-          <w:rFonts w:ascii="KoPub돋움체 Light" w:eastAsia="KoPub돋움체 Light" w:hAnsi="KoPub돋움체 Light" w:cs="Arial Unicode MS"/>
-        </w:rPr>
-        <w:t xml:space="preserve">) 게이트웨이 아키텍처를 제안한다.  </w:t>
-      </w:r>
-    </w:p>
-    <w:p>
-      <w:pPr>
-        <w:rPr>
-          <w:rFonts w:ascii="KoPub돋움체 Light" w:eastAsia="KoPub돋움체 Light" w:hAnsi="KoPub돋움체 Light"/>
-        </w:rPr>
-      </w:pPr>
-    </w:p>
-    <w:p>
-      <w:pPr>
-        <w:ind w:firstLineChars="100" w:firstLine="198"/>
-        <w:rPr>
-          <w:rFonts w:ascii="KoPub돋움체 Light" w:eastAsia="KoPub돋움체 Light" w:hAnsi="KoPub돋움체 Light" w:hint="eastAsia"/>
-        </w:rPr>
-      </w:pPr>
-      <w:r>
-        <w:rPr>
-          <w:rFonts w:ascii="KoPub돋움체 Light" w:eastAsia="KoPub돋움체 Light" w:hAnsi="KoPub돋움체 Light" w:cs="Arial Unicode MS"/>
-        </w:rPr>
-        <w:t xml:space="preserve">제안 시스템은 대용량 페이로드의 메모리 부하를 방지하기 위해 스트리밍 다이제스트 파이프라인으로 요청을 정규화하고, 비인가 대량 트래픽 차단을 위해 시간 복잡도 O(1)의 슬라이딩 윈도우 </w:t>
-      </w:r>
-      <w:proofErr w:type="spellStart"/>
-      <w:r>
-        <w:rPr>
-          <w:rFonts w:ascii="KoPub돋움체 Light" w:eastAsia="KoPub돋움체 Light" w:hAnsi="KoPub돋움체 Light" w:cs="Arial Unicode MS"/>
-        </w:rPr>
-        <w:t>인그레스</w:t>
-      </w:r>
-      <w:proofErr w:type="spellEnd"/>
-      <w:r>
-        <w:rPr>
-          <w:rFonts w:ascii="KoPub돋움체 Light" w:eastAsia="KoPub돋움체 Light" w:hAnsi="KoPub돋움체 Light" w:cs="Arial Unicode MS"/>
-        </w:rPr>
-        <w:t xml:space="preserve"> 제어 메커니즘을 적용하였다. 또한 타원곡선 서명 검증을 비동기 스레드 풀로 위임하여 단일 노드의 동시 접속 처리 성능을 극대화하였다. 성능 평가 결과, 제안하는 ECDSA P-256 서명 바인딩은 표준 토큰 검증 대비 지연시간 오버헤드를 평균 +25.65 %로 억제하였으며, RSA-2048 대비 HTTP 헤더 페이로드를 50 % 절감하였다. 아울러 동시성 최적화를 통해 100명의 가상 유저 부하 환경에서도 초당 780건의 처리량(RPS)을 달성하여 고부하 트래픽에 대한 방어 실효성과 실무 적용 타당성을 입증하였다.</w:t>
-      </w:r>
-    </w:p>
-    <w:p>
-      <w:pPr>
-        <w:rPr>
-          <w:rFonts w:ascii="KoPub돋움체 Light" w:eastAsia="KoPub돋움체 Light" w:hAnsi="KoPub돋움체 Light"/>
-        </w:rPr>
-      </w:pPr>
-    </w:p>
-    <w:p>
-      <w:pPr>
-        <w:pStyle w:val="3"/>
-        <w:spacing w:before="0"/>
-        <w:rPr>
-          <w:rFonts w:ascii="KoPub돋움체 Light" w:eastAsia="KoPub돋움체 Light" w:hAnsi="KoPub돋움체 Light" w:cs="Arial Unicode MS"/>
-        </w:rPr>
-      </w:pPr>
       <w:bookmarkStart w:id="3" w:name="_8rflvs2gdn72" w:colFirst="0" w:colLast="0"/>
       <w:bookmarkEnd w:id="3"/>
       <w:r>
@@ -200,13 +231,7 @@
         <w:t>I. 서론</w:t>
       </w:r>
     </w:p>
-    <w:p>
-      <w:pPr>
-        <w:rPr>
-          <w:rFonts w:hint="eastAsia"/>
-        </w:rPr>
-      </w:pPr>
-    </w:p>
+    <w:p/>
     <w:p>
       <w:pPr>
         <w:pBdr>
@@ -365,14 +390,8 @@
         <w:rPr>
           <w:rFonts w:ascii="KoPub돋움체 Light" w:eastAsia="KoPub돋움체 Light" w:hAnsi="KoPub돋움체 Light" w:cs="Arial Unicode MS"/>
         </w:rPr>
-        <w:t xml:space="preserve">본 연구에서는 하드웨어 격리 장치에 개인키를 보관하는 FIDO2 규격을 역방향 프록시 게이트웨이와 결합하는 아키텍처를 제안한다. 클라이언트는 하드웨어 칩셋 내부에서 생성한 디지털 서명을 HTTP 헤더에 </w:t>
-      </w:r>
-      <w:r>
-        <w:rPr>
-          <w:rFonts w:ascii="KoPub돋움체 Light" w:eastAsia="KoPub돋움체 Light" w:hAnsi="KoPub돋움체 Light" w:cs="Arial Unicode MS"/>
-        </w:rPr>
         <w:lastRenderedPageBreak/>
-        <w:t xml:space="preserve">부착하여 전송하며, 게이트웨이는 요청 중계 전 서명의 유효성을 검증하여 세션 </w:t>
+        <w:t xml:space="preserve">본 연구에서는 하드웨어 격리 장치에 개인키를 보관하는 FIDO2 규격을 역방향 프록시 게이트웨이와 결합하는 아키텍처를 제안한다. 클라이언트는 하드웨어 칩셋 내부에서 생성한 디지털 서명을 HTTP 헤더에 부착하여 전송하며, 게이트웨이는 요청 중계 전 서명의 유효성을 검증하여 세션 </w:t>
       </w:r>
       <w:proofErr w:type="spellStart"/>
       <w:r>
@@ -630,13 +649,7 @@
         <w:t>1. 웹 인증 토큰과 키 바인딩 규격</w:t>
       </w:r>
     </w:p>
-    <w:p>
-      <w:pPr>
-        <w:rPr>
-          <w:rFonts w:hint="eastAsia"/>
-        </w:rPr>
-      </w:pPr>
-    </w:p>
+    <w:p/>
     <w:p>
       <w:pPr>
         <w:pBdr>
@@ -833,7 +846,7 @@
         <w:spacing w:after="240"/>
         <w:ind w:firstLineChars="100" w:firstLine="198"/>
         <w:rPr>
-          <w:rFonts w:ascii="KoPub돋움체 Light" w:eastAsia="KoPub돋움체 Light" w:hAnsi="KoPub돋움체 Light" w:hint="eastAsia"/>
+          <w:rFonts w:ascii="KoPub돋움체 Light" w:eastAsia="KoPub돋움체 Light" w:hAnsi="KoPub돋움체 Light"/>
         </w:rPr>
       </w:pPr>
     </w:p>
@@ -868,13 +881,7 @@
         <w:t xml:space="preserve"> 표준과 하드웨어 격리 구조</w:t>
       </w:r>
     </w:p>
-    <w:p>
-      <w:pPr>
-        <w:rPr>
-          <w:rFonts w:hint="eastAsia"/>
-        </w:rPr>
-      </w:pPr>
-    </w:p>
+    <w:p/>
     <w:p>
       <w:pPr>
         <w:pBdr>
@@ -921,7 +928,14 @@
         <w:rPr>
           <w:rFonts w:ascii="KoPub돋움체 Light" w:eastAsia="KoPub돋움체 Light" w:hAnsi="KoPub돋움체 Light" w:cs="Arial Unicode MS"/>
         </w:rPr>
-        <w:t>(Secure Enclave), 외장형 보안 토큰을 하드웨어 인증기로 사용한다.</w:t>
+        <w:t xml:space="preserve">(Secure </w:t>
+      </w:r>
+      <w:r>
+        <w:rPr>
+          <w:rFonts w:ascii="KoPub돋움체 Light" w:eastAsia="KoPub돋움체 Light" w:hAnsi="KoPub돋움체 Light" w:cs="Arial Unicode MS"/>
+        </w:rPr>
+        <w:lastRenderedPageBreak/>
+        <w:t>Enclave), 외장형 보안 토큰을 하드웨어 인증기로 사용한다.</w:t>
       </w:r>
     </w:p>
     <w:p>
@@ -958,7 +972,6 @@
         <w:rPr>
           <w:rFonts w:ascii="KoPub돋움체 Light" w:eastAsia="KoPub돋움체 Light" w:hAnsi="KoPub돋움체 Light" w:cs="Arial Unicode MS"/>
         </w:rPr>
-        <w:lastRenderedPageBreak/>
         <w:t xml:space="preserve">하드웨어 인증기는 비대칭 키 쌍을 내부 논리회로에서 직접 생성하고 보관한다. 운영체제와 브라우저는 API를 통해 서명 연산을 하드웨어로 위임하며, 하드웨어는 연산 결과인 </w:t>
       </w:r>
       <w:proofErr w:type="spellStart"/>
@@ -1008,13 +1021,7 @@
         <w:t>3. 암호학적 특성 비교: ECDSA P-256 대 RSA-2048</w:t>
       </w:r>
     </w:p>
-    <w:p>
-      <w:pPr>
-        <w:rPr>
-          <w:rFonts w:hint="eastAsia"/>
-        </w:rPr>
-      </w:pPr>
-    </w:p>
+    <w:p/>
     <w:p>
       <w:pPr>
         <w:pBdr>
@@ -1809,13 +1816,7 @@
         <w:t>1. 시스템 모델 및 공격자 역량 정의</w:t>
       </w:r>
     </w:p>
-    <w:p>
-      <w:pPr>
-        <w:rPr>
-          <w:rFonts w:hint="eastAsia"/>
-        </w:rPr>
-      </w:pPr>
-    </w:p>
+    <w:p/>
     <w:p>
       <w:pPr>
         <w:pBdr>
@@ -1835,14 +1836,7 @@
         <w:rPr>
           <w:rFonts w:ascii="KoPub돋움체 Light" w:eastAsia="KoPub돋움체 Light" w:hAnsi="KoPub돋움체 Light" w:cs="Arial Unicode MS"/>
         </w:rPr>
-        <w:t xml:space="preserve">본 연구에서는 Dolev-Yao 공격 모델을 확장하여[7] 네트워크 및 호스트 계층에서의 공격자 역량을 </w:t>
-      </w:r>
-      <w:r>
-        <w:rPr>
-          <w:rFonts w:ascii="KoPub돋움체 Light" w:eastAsia="KoPub돋움체 Light" w:hAnsi="KoPub돋움체 Light" w:cs="Arial Unicode MS"/>
-        </w:rPr>
-        <w:lastRenderedPageBreak/>
-        <w:t xml:space="preserve">정의한다. 공격자는 클라이언트와 게이트웨이 간의 네트워크 트래픽을 도청, 변조, 주입, 지연한다. 또한 호스트 계층에서 브라우저 스토리지나 운영체제 사용자 공간의 메모리에 접근하여 런타임 토큰 및 세션 </w:t>
+        <w:t xml:space="preserve">본 연구에서는 Dolev-Yao 공격 모델을 확장하여[7] 네트워크 및 호스트 계층에서의 공격자 역량을 정의한다. 공격자는 클라이언트와 게이트웨이 간의 네트워크 트래픽을 도청, 변조, 주입, 지연한다. 또한 호스트 계층에서 브라우저 스토리지나 운영체제 사용자 공간의 메모리에 접근하여 런타임 토큰 및 세션 </w:t>
       </w:r>
       <w:proofErr w:type="spellStart"/>
       <w:r>
@@ -1885,7 +1879,7 @@
         <w:spacing w:after="240"/>
         <w:ind w:firstLine="720"/>
         <w:rPr>
-          <w:rFonts w:ascii="KoPub돋움체 Light" w:eastAsia="KoPub돋움체 Light" w:hAnsi="KoPub돋움체 Light" w:hint="eastAsia"/>
+          <w:rFonts w:ascii="KoPub돋움체 Light" w:eastAsia="KoPub돋움체 Light" w:hAnsi="KoPub돋움체 Light"/>
         </w:rPr>
       </w:pPr>
     </w:p>
@@ -1907,15 +1901,10 @@
       </w:r>
     </w:p>
     <w:p>
-      <w:pPr>
+      <w:r>
         <w:rPr>
           <w:rFonts w:hint="eastAsia"/>
         </w:rPr>
-      </w:pPr>
-      <w:r>
-        <w:rPr>
-          <w:rFonts w:hint="eastAsia"/>
-        </w:rPr>
         <w:t>]</w:t>
       </w:r>
     </w:p>
@@ -1936,7 +1925,7 @@
     <w:p>
       <w:pPr>
         <w:rPr>
-          <w:rFonts w:ascii="KoPub돋움체 Light" w:eastAsia="KoPub돋움체 Light" w:hAnsi="KoPub돋움체 Light" w:hint="eastAsia"/>
+          <w:rFonts w:ascii="KoPub돋움체 Light" w:eastAsia="KoPub돋움체 Light" w:hAnsi="KoPub돋움체 Light"/>
         </w:rPr>
       </w:pPr>
     </w:p>
@@ -2155,7 +2144,7 @@
         <w:spacing w:after="240"/>
         <w:ind w:firstLine="720"/>
         <w:rPr>
-          <w:rFonts w:ascii="KoPub돋움체 Light" w:eastAsia="KoPub돋움체 Light" w:hAnsi="KoPub돋움체 Light" w:cs="Arial Unicode MS" w:hint="eastAsia"/>
+          <w:rFonts w:ascii="KoPub돋움체 Light" w:eastAsia="KoPub돋움체 Light" w:hAnsi="KoPub돋움체 Light" w:cs="Arial Unicode MS"/>
         </w:rPr>
       </w:pPr>
       <w:r>
@@ -2295,7 +2284,7 @@
                     </pic:cNvPicPr>
                   </pic:nvPicPr>
                   <pic:blipFill>
-                    <a:blip r:embed="rId5" cstate="print">
+                    <a:blip r:embed="rId7" cstate="print">
                       <a:extLst>
                         <a:ext uri="{28A0092B-C50C-407E-A947-70E740481C1C}">
                           <a14:useLocalDpi xmlns:a14="http://schemas.microsoft.com/office/drawing/2010/main" val="0"/>
@@ -2338,7 +2327,7 @@
         </w:pBdr>
         <w:spacing w:after="240"/>
         <w:rPr>
-          <w:rFonts w:ascii="KoPub돋움체 Light" w:eastAsia="KoPub돋움체 Light" w:hAnsi="KoPub돋움체 Light" w:hint="eastAsia"/>
+          <w:rFonts w:ascii="KoPub돋움체 Light" w:eastAsia="KoPub돋움체 Light" w:hAnsi="KoPub돋움체 Light"/>
         </w:rPr>
       </w:pPr>
     </w:p>
@@ -2359,13 +2348,7 @@
         <w:t>2. HTTP 요청 컨텍스트 정규화 및 스트리밍 다이제스트</w:t>
       </w:r>
     </w:p>
-    <w:p>
-      <w:pPr>
-        <w:rPr>
-          <w:rFonts w:hint="eastAsia"/>
-        </w:rPr>
-      </w:pPr>
-    </w:p>
+    <w:p/>
     <w:p>
       <w:pPr>
         <w:pBdr>
@@ -2502,7 +2485,7 @@
         <w:spacing w:after="240"/>
         <w:ind w:firstLineChars="100" w:firstLine="198"/>
         <w:rPr>
-          <w:rFonts w:ascii="KoPub돋움체 Light" w:eastAsia="KoPub돋움체 Light" w:hAnsi="KoPub돋움체 Light" w:cs="Arial Unicode MS" w:hint="eastAsia"/>
+          <w:rFonts w:ascii="KoPub돋움체 Light" w:eastAsia="KoPub돋움체 Light" w:hAnsi="KoPub돋움체 Light" w:cs="Arial Unicode MS"/>
         </w:rPr>
       </w:pPr>
       <w:r>
@@ -2573,13 +2556,7 @@
         <w:t>3. Fast-Fail 단축 검증 파이프라인</w:t>
       </w:r>
     </w:p>
-    <w:p>
-      <w:pPr>
-        <w:rPr>
-          <w:rFonts w:hint="eastAsia"/>
-        </w:rPr>
-      </w:pPr>
-    </w:p>
+    <w:p/>
     <w:p>
       <w:pPr>
         <w:pBdr>
@@ -2856,7 +2833,7 @@
         </w:pBdr>
         <w:ind w:firstLineChars="100" w:firstLine="198"/>
         <w:rPr>
-          <w:rFonts w:ascii="KoPub돋움체 Light" w:eastAsia="KoPub돋움체 Light" w:hAnsi="KoPub돋움체 Light" w:hint="eastAsia"/>
+          <w:rFonts w:ascii="KoPub돋움체 Light" w:eastAsia="KoPub돋움체 Light" w:hAnsi="KoPub돋움체 Light"/>
         </w:rPr>
       </w:pPr>
     </w:p>
@@ -2908,11 +2885,6 @@
           <w:rFonts w:ascii="KoPub돋움체 Light" w:eastAsia="KoPub돋움체 Light" w:hAnsi="KoPub돋움체 Light"/>
         </w:rPr>
         <w:tab/>
-      </w:r>
-      <w:r>
-        <w:rPr>
-          <w:rFonts w:ascii="KoPub돋움체 Light" w:eastAsia="KoPub돋움체 Light" w:hAnsi="KoPub돋움체 Light"/>
-        </w:rPr>
         <w:t xml:space="preserve">난수 발급 </w:t>
       </w:r>
       <w:proofErr w:type="spellStart"/>
@@ -2933,7 +2905,7 @@
     <w:p>
       <w:pPr>
         <w:rPr>
-          <w:rFonts w:ascii="KoPub돋움체 Light" w:eastAsia="KoPub돋움체 Light" w:hAnsi="KoPub돋움체 Light" w:hint="eastAsia"/>
+          <w:rFonts w:ascii="KoPub돋움체 Light" w:eastAsia="KoPub돋움체 Light" w:hAnsi="KoPub돋움체 Light"/>
         </w:rPr>
       </w:pPr>
     </w:p>
@@ -3087,7 +3059,7 @@
           <w:between w:val="nil"/>
         </w:pBdr>
         <w:rPr>
-          <w:rFonts w:ascii="KoPub돋움체 Light" w:eastAsia="KoPub돋움체 Light" w:hAnsi="KoPub돋움체 Light" w:hint="eastAsia"/>
+          <w:rFonts w:ascii="KoPub돋움체 Light" w:eastAsia="KoPub돋움체 Light" w:hAnsi="KoPub돋움체 Light"/>
         </w:rPr>
       </w:pPr>
     </w:p>
@@ -3124,13 +3096,7 @@
         <w:t>1. 실험 환경 및 프로토타입 구현</w:t>
       </w:r>
     </w:p>
-    <w:p>
-      <w:pPr>
-        <w:rPr>
-          <w:rFonts w:hint="eastAsia"/>
-        </w:rPr>
-      </w:pPr>
-    </w:p>
+    <w:p/>
     <w:p>
       <w:pPr>
         <w:pBdr>
@@ -3255,7 +3221,7 @@
         </w:pBdr>
         <w:spacing w:after="240"/>
         <w:rPr>
-          <w:rFonts w:ascii="KoPub돋움체 Light" w:eastAsia="KoPub돋움체 Light" w:hAnsi="KoPub돋움체 Light" w:cs="Arial Unicode MS" w:hint="eastAsia"/>
+          <w:rFonts w:ascii="KoPub돋움체 Light" w:eastAsia="KoPub돋움체 Light" w:hAnsi="KoPub돋움체 Light" w:cs="Arial Unicode MS"/>
         </w:rPr>
       </w:pPr>
     </w:p>
@@ -3306,7 +3272,7 @@
         </w:pBdr>
         <w:spacing w:after="240"/>
         <w:rPr>
-          <w:rFonts w:ascii="KoPub돋움체 Light" w:eastAsia="KoPub돋움체 Light" w:hAnsi="KoPub돋움체 Light" w:hint="eastAsia"/>
+          <w:rFonts w:ascii="KoPub돋움체 Light" w:eastAsia="KoPub돋움체 Light" w:hAnsi="KoPub돋움체 Light"/>
         </w:rPr>
       </w:pPr>
     </w:p>
@@ -3327,13 +3293,7 @@
         <w:t>2. 모의 공격 시뮬레이션을 통한 보안 검증</w:t>
       </w:r>
     </w:p>
-    <w:p>
-      <w:pPr>
-        <w:rPr>
-          <w:rFonts w:hint="eastAsia"/>
-        </w:rPr>
-      </w:pPr>
-    </w:p>
+    <w:p/>
     <w:p>
       <w:pPr>
         <w:ind w:firstLine="720"/>
@@ -3351,7 +3311,7 @@
     <w:p>
       <w:pPr>
         <w:rPr>
-          <w:rFonts w:ascii="KoPub돋움체 Light" w:eastAsia="KoPub돋움체 Light" w:hAnsi="KoPub돋움체 Light" w:hint="eastAsia"/>
+          <w:rFonts w:ascii="KoPub돋움체 Light" w:eastAsia="KoPub돋움체 Light" w:hAnsi="KoPub돋움체 Light"/>
         </w:rPr>
       </w:pPr>
     </w:p>
@@ -4225,7 +4185,7 @@
         <w:spacing w:before="300" w:after="240"/>
         <w:ind w:firstLine="720"/>
         <w:rPr>
-          <w:rFonts w:ascii="KoPub돋움체 Light" w:eastAsia="KoPub돋움체 Light" w:hAnsi="KoPub돋움체 Light" w:cs="Arial Unicode MS" w:hint="eastAsia"/>
+          <w:rFonts w:ascii="KoPub돋움체 Light" w:eastAsia="KoPub돋움체 Light" w:hAnsi="KoPub돋움체 Light" w:cs="Arial Unicode MS"/>
         </w:rPr>
       </w:pPr>
       <w:r>
@@ -4311,13 +4271,7 @@
         <w:t xml:space="preserve"> 제어 메커니즘의 차단 유효성 평가</w:t>
       </w:r>
     </w:p>
-    <w:p>
-      <w:pPr>
-        <w:rPr>
-          <w:rFonts w:hint="eastAsia"/>
-        </w:rPr>
-      </w:pPr>
-    </w:p>
+    <w:p/>
     <w:p>
       <w:pPr>
         <w:pBdr>
@@ -4395,7 +4349,7 @@
         <w:spacing w:after="240"/>
         <w:ind w:firstLineChars="100" w:firstLine="198"/>
         <w:rPr>
-          <w:rFonts w:ascii="KoPub돋움체 Light" w:eastAsia="KoPub돋움체 Light" w:hAnsi="KoPub돋움체 Light" w:cs="Arial Unicode MS" w:hint="eastAsia"/>
+          <w:rFonts w:ascii="KoPub돋움체 Light" w:eastAsia="KoPub돋움체 Light" w:hAnsi="KoPub돋움체 Light" w:cs="Arial Unicode MS"/>
         </w:rPr>
       </w:pPr>
       <w:r>
@@ -4455,11 +4409,6 @@
           <w:rFonts w:ascii="KoPub돋움체 Light" w:eastAsia="KoPub돋움체 Light" w:hAnsi="KoPub돋움체 Light"/>
         </w:rPr>
         <w:tab/>
-      </w:r>
-      <w:r>
-        <w:rPr>
-          <w:rFonts w:ascii="KoPub돋움체 Light" w:eastAsia="KoPub돋움체 Light" w:hAnsi="KoPub돋움체 Light"/>
-        </w:rPr>
         <w:t xml:space="preserve">보안 계층 추가에 따른 성능 비용을 분석하기 위해 표준 토큰 검증(모드 A), RSA-2048 기반 </w:t>
       </w:r>
       <w:proofErr w:type="spellStart"/>
@@ -4494,7 +4443,7 @@
     <w:p>
       <w:pPr>
         <w:rPr>
-          <w:rFonts w:ascii="KoPub돋움체 Light" w:eastAsia="KoPub돋움체 Light" w:hAnsi="KoPub돋움체 Light" w:hint="eastAsia"/>
+          <w:rFonts w:ascii="KoPub돋움체 Light" w:eastAsia="KoPub돋움체 Light" w:hAnsi="KoPub돋움체 Light"/>
         </w:rPr>
       </w:pPr>
     </w:p>
@@ -5615,7 +5564,7 @@
     <w:p>
       <w:pPr>
         <w:rPr>
-          <w:rFonts w:ascii="KoPub돋움체 Light" w:eastAsia="KoPub돋움체 Light" w:hAnsi="KoPub돋움체 Light" w:hint="eastAsia"/>
+          <w:rFonts w:ascii="KoPub돋움체 Light" w:eastAsia="KoPub돋움체 Light" w:hAnsi="KoPub돋움체 Light"/>
         </w:rPr>
       </w:pPr>
     </w:p>
@@ -5636,13 +5585,7 @@
         <w:t>5. 대규모 동시 접속 부하 및 동시성 최적화 성능 평가</w:t>
       </w:r>
     </w:p>
-    <w:p>
-      <w:pPr>
-        <w:rPr>
-          <w:rFonts w:hint="eastAsia"/>
-        </w:rPr>
-      </w:pPr>
-    </w:p>
+    <w:p/>
     <w:p>
       <w:pPr>
         <w:pBdr>
@@ -5654,7 +5597,7 @@
         </w:pBdr>
         <w:ind w:firstLine="720"/>
         <w:rPr>
-          <w:rFonts w:ascii="KoPub돋움체 Light" w:eastAsia="KoPub돋움체 Light" w:hAnsi="KoPub돋움체 Light" w:cs="Arial Unicode MS" w:hint="eastAsia"/>
+          <w:rFonts w:ascii="KoPub돋움체 Light" w:eastAsia="KoPub돋움체 Light" w:hAnsi="KoPub돋움체 Light" w:cs="Arial Unicode MS"/>
         </w:rPr>
       </w:pPr>
       <w:r>
@@ -5667,7 +5610,7 @@
     <w:p>
       <w:pPr>
         <w:rPr>
-          <w:rFonts w:ascii="KoPub돋움체 Light" w:eastAsia="KoPub돋움체 Light" w:hAnsi="KoPub돋움체 Light" w:hint="eastAsia"/>
+          <w:rFonts w:ascii="KoPub돋움체 Light" w:eastAsia="KoPub돋움체 Light" w:hAnsi="KoPub돋움체 Light"/>
         </w:rPr>
       </w:pPr>
     </w:p>
@@ -6527,7 +6470,19 @@
         <w:rPr>
           <w:rFonts w:ascii="KoPub돋움체 Light" w:eastAsia="KoPub돋움체 Light" w:hAnsi="KoPub돋움체 Light" w:cs="Arial Unicode MS"/>
         </w:rPr>
-        <w:t>VI. 결론 및 향후 연구</w:t>
+        <w:t xml:space="preserve">VI. </w:t>
+      </w:r>
+      <w:r>
+        <w:rPr>
+          <w:rFonts w:ascii="KoPub돋움체 Light" w:eastAsia="KoPub돋움체 Light" w:hAnsi="KoPub돋움체 Light" w:cs="Arial Unicode MS" w:hint="eastAsia"/>
+        </w:rPr>
+        <w:t>논의</w:t>
+      </w:r>
+      <w:r>
+        <w:rPr>
+          <w:rFonts w:ascii="KoPub돋움체 Light" w:eastAsia="KoPub돋움체 Light" w:hAnsi="KoPub돋움체 Light" w:cs="Arial Unicode MS"/>
+        </w:rPr>
+        <w:t xml:space="preserve"> 및 향후 연구</w:t>
       </w:r>
     </w:p>
     <w:p>
@@ -6547,13 +6502,7 @@
         <w:t>1. 연구 결과 요약</w:t>
       </w:r>
     </w:p>
-    <w:p>
-      <w:pPr>
-        <w:rPr>
-          <w:rFonts w:hint="eastAsia"/>
-        </w:rPr>
-      </w:pPr>
-    </w:p>
+    <w:p/>
     <w:p>
       <w:pPr>
         <w:rPr>
@@ -6565,11 +6514,6 @@
           <w:rFonts w:ascii="KoPub돋움체 Light" w:eastAsia="KoPub돋움체 Light" w:hAnsi="KoPub돋움체 Light"/>
         </w:rPr>
         <w:tab/>
-      </w:r>
-      <w:r>
-        <w:rPr>
-          <w:rFonts w:ascii="KoPub돋움체 Light" w:eastAsia="KoPub돋움체 Light" w:hAnsi="KoPub돋움체 Light"/>
-        </w:rPr>
         <w:t xml:space="preserve">본 연구에서는 웹 환경에서 소지자 토큰의 탈취 및 세션 </w:t>
       </w:r>
       <w:proofErr w:type="spellStart"/>
@@ -6611,7 +6555,7 @@
     <w:p>
       <w:pPr>
         <w:rPr>
-          <w:rFonts w:ascii="KoPub돋움체 Light" w:eastAsia="KoPub돋움체 Light" w:hAnsi="KoPub돋움체 Light" w:hint="eastAsia"/>
+          <w:rFonts w:ascii="KoPub돋움체 Light" w:eastAsia="KoPub돋움체 Light" w:hAnsi="KoPub돋움체 Light"/>
         </w:rPr>
       </w:pPr>
     </w:p>
@@ -6808,13 +6752,7 @@
         <w:t>2. 연구의 한계점</w:t>
       </w:r>
     </w:p>
-    <w:p>
-      <w:pPr>
-        <w:rPr>
-          <w:rFonts w:hint="eastAsia"/>
-        </w:rPr>
-      </w:pPr>
-    </w:p>
+    <w:p/>
     <w:p>
       <w:pPr>
         <w:rPr>
@@ -6826,18 +6764,13 @@
           <w:rFonts w:ascii="KoPub돋움체 Light" w:eastAsia="KoPub돋움체 Light" w:hAnsi="KoPub돋움체 Light"/>
         </w:rPr>
         <w:tab/>
-      </w:r>
-      <w:r>
-        <w:rPr>
-          <w:rFonts w:ascii="KoPub돋움체 Light" w:eastAsia="KoPub돋움체 Light" w:hAnsi="KoPub돋움체 Light"/>
-        </w:rPr>
         <w:t>본 연구의 구현 및 검증 환경 한계는 다음과 같다.</w:t>
       </w:r>
     </w:p>
     <w:p>
       <w:pPr>
         <w:rPr>
-          <w:rFonts w:ascii="KoPub돋움체 Light" w:eastAsia="KoPub돋움체 Light" w:hAnsi="KoPub돋움체 Light" w:hint="eastAsia"/>
+          <w:rFonts w:ascii="KoPub돋움체 Light" w:eastAsia="KoPub돋움체 Light" w:hAnsi="KoPub돋움체 Light"/>
         </w:rPr>
       </w:pPr>
     </w:p>
@@ -6896,7 +6829,7 @@
         </w:pBdr>
         <w:ind w:left="600"/>
         <w:rPr>
-          <w:rFonts w:ascii="KoPub돋움체 Light" w:eastAsia="KoPub돋움체 Light" w:hAnsi="KoPub돋움체 Light" w:hint="eastAsia"/>
+          <w:rFonts w:ascii="KoPub돋움체 Light" w:eastAsia="KoPub돋움체 Light" w:hAnsi="KoPub돋움체 Light"/>
         </w:rPr>
       </w:pPr>
     </w:p>
@@ -6914,53 +6847,53 @@
           <w:between w:val="nil"/>
         </w:pBdr>
         <w:rPr>
+          <w:rFonts w:ascii="KoPub돋움체 Light" w:eastAsia="KoPub돋움체 Light" w:hAnsi="KoPub돋움체 Light" w:cs="Arial Unicode MS"/>
+        </w:rPr>
+      </w:pPr>
+      <w:r>
+        <w:rPr>
+          <w:rFonts w:ascii="KoPub돋움체 Light" w:eastAsia="KoPub돋움체 Light" w:hAnsi="KoPub돋움체 Light" w:cs="Arial Unicode MS"/>
+        </w:rPr>
+        <w:t xml:space="preserve">단일 노드 인메모리 아키텍처의 확장성 제약: </w:t>
+      </w:r>
+      <w:r>
+        <w:rPr>
+          <w:rFonts w:ascii="KoPub돋움체 Light" w:eastAsia="KoPub돋움체 Light" w:hAnsi="KoPub돋움체 Light" w:cs="Arial Unicode MS"/>
+        </w:rPr>
+        <w:t xml:space="preserve">제안 시스템의 난수 캐시와 슬라이딩 윈도우 </w:t>
+      </w:r>
+      <w:proofErr w:type="spellStart"/>
+      <w:r>
+        <w:rPr>
+          <w:rFonts w:ascii="KoPub돋움체 Light" w:eastAsia="KoPub돋움체 Light" w:hAnsi="KoPub돋움체 Light" w:cs="Arial Unicode MS"/>
+        </w:rPr>
+        <w:t>인그레스</w:t>
+      </w:r>
+      <w:proofErr w:type="spellEnd"/>
+      <w:r>
+        <w:rPr>
+          <w:rFonts w:ascii="KoPub돋움체 Light" w:eastAsia="KoPub돋움체 Light" w:hAnsi="KoPub돋움체 Light" w:cs="Arial Unicode MS"/>
+        </w:rPr>
+        <w:t xml:space="preserve"> 제어기는 단일 프로세스의 스레드 안전성을 기준으로 설계하였다. 따라서 로드 </w:t>
+      </w:r>
+      <w:proofErr w:type="spellStart"/>
+      <w:r>
+        <w:rPr>
+          <w:rFonts w:ascii="KoPub돋움체 Light" w:eastAsia="KoPub돋움체 Light" w:hAnsi="KoPub돋움체 Light" w:cs="Arial Unicode MS"/>
+        </w:rPr>
+        <w:t>밸런서</w:t>
+      </w:r>
+      <w:proofErr w:type="spellEnd"/>
+      <w:r>
+        <w:rPr>
+          <w:rFonts w:ascii="KoPub돋움체 Light" w:eastAsia="KoPub돋움체 Light" w:hAnsi="KoPub돋움체 Light" w:cs="Arial Unicode MS"/>
+        </w:rPr>
+        <w:t xml:space="preserve"> 기반의 다중 게이트웨이 인스턴스로 수평 확장할 경우 인스턴스 간 상태 불일치 문제가 발생한다</w:t>
+      </w:r>
+      <w:r>
+        <w:rPr>
           <w:rFonts w:ascii="KoPub돋움체 Light" w:eastAsia="KoPub돋움체 Light" w:hAnsi="KoPub돋움체 Light" w:cs="Arial Unicode MS" w:hint="eastAsia"/>
         </w:rPr>
-      </w:pPr>
-      <w:r>
-        <w:rPr>
-          <w:rFonts w:ascii="KoPub돋움체 Light" w:eastAsia="KoPub돋움체 Light" w:hAnsi="KoPub돋움체 Light" w:cs="Arial Unicode MS"/>
-        </w:rPr>
-        <w:t xml:space="preserve">단일 노드 인메모리 아키텍처의 확장성 제약: </w:t>
-      </w:r>
-      <w:r>
-        <w:rPr>
-          <w:rFonts w:ascii="KoPub돋움체 Light" w:eastAsia="KoPub돋움체 Light" w:hAnsi="KoPub돋움체 Light" w:cs="Arial Unicode MS"/>
-        </w:rPr>
-        <w:t xml:space="preserve">제안 시스템의 난수 캐시와 슬라이딩 윈도우 </w:t>
-      </w:r>
-      <w:proofErr w:type="spellStart"/>
-      <w:r>
-        <w:rPr>
-          <w:rFonts w:ascii="KoPub돋움체 Light" w:eastAsia="KoPub돋움체 Light" w:hAnsi="KoPub돋움체 Light" w:cs="Arial Unicode MS"/>
-        </w:rPr>
-        <w:t>인그레스</w:t>
-      </w:r>
-      <w:proofErr w:type="spellEnd"/>
-      <w:r>
-        <w:rPr>
-          <w:rFonts w:ascii="KoPub돋움체 Light" w:eastAsia="KoPub돋움체 Light" w:hAnsi="KoPub돋움체 Light" w:cs="Arial Unicode MS"/>
-        </w:rPr>
-        <w:t xml:space="preserve"> 제어기는 단일 프로세스의 스레드 안전성을 기준으로 설계하였다. 따라서 로드 </w:t>
-      </w:r>
-      <w:proofErr w:type="spellStart"/>
-      <w:r>
-        <w:rPr>
-          <w:rFonts w:ascii="KoPub돋움체 Light" w:eastAsia="KoPub돋움체 Light" w:hAnsi="KoPub돋움체 Light" w:cs="Arial Unicode MS"/>
-        </w:rPr>
-        <w:t>밸런서</w:t>
-      </w:r>
-      <w:proofErr w:type="spellEnd"/>
-      <w:r>
-        <w:rPr>
-          <w:rFonts w:ascii="KoPub돋움체 Light" w:eastAsia="KoPub돋움체 Light" w:hAnsi="KoPub돋움체 Light" w:cs="Arial Unicode MS"/>
-        </w:rPr>
-        <w:t xml:space="preserve"> 기반의 다중 게이트웨이 인스턴스로 수평 확장할 경우 인스턴스 간 상태 불일치 문제가 발생한다</w:t>
-      </w:r>
-      <w:r>
-        <w:rPr>
-          <w:rFonts w:ascii="KoPub돋움체 Light" w:eastAsia="KoPub돋움체 Light" w:hAnsi="KoPub돋움체 Light" w:cs="Arial Unicode MS" w:hint="eastAsia"/>
-        </w:rPr>
         <w:t>.</w:t>
       </w:r>
     </w:p>
@@ -6974,7 +6907,7 @@
           <w:between w:val="nil"/>
         </w:pBdr>
         <w:rPr>
-          <w:rFonts w:ascii="KoPub돋움체 Light" w:eastAsia="KoPub돋움체 Light" w:hAnsi="KoPub돋움체 Light" w:hint="eastAsia"/>
+          <w:rFonts w:ascii="KoPub돋움체 Light" w:eastAsia="KoPub돋움체 Light" w:hAnsi="KoPub돋움체 Light"/>
         </w:rPr>
       </w:pPr>
     </w:p>
@@ -6995,13 +6928,7 @@
         <w:t>3. 향후 연구 과제</w:t>
       </w:r>
     </w:p>
-    <w:p>
-      <w:pPr>
-        <w:rPr>
-          <w:rFonts w:hint="eastAsia"/>
-        </w:rPr>
-      </w:pPr>
-    </w:p>
+    <w:p/>
     <w:p>
       <w:pPr>
         <w:ind w:firstLine="600"/>
@@ -7019,7 +6946,7 @@
     <w:p>
       <w:pPr>
         <w:rPr>
-          <w:rFonts w:ascii="KoPub돋움체 Light" w:eastAsia="KoPub돋움체 Light" w:hAnsi="KoPub돋움체 Light" w:hint="eastAsia"/>
+          <w:rFonts w:ascii="KoPub돋움체 Light" w:eastAsia="KoPub돋움체 Light" w:hAnsi="KoPub돋움체 Light"/>
         </w:rPr>
       </w:pPr>
     </w:p>
@@ -7078,7 +7005,7 @@
         </w:pBdr>
         <w:ind w:left="600"/>
         <w:rPr>
-          <w:rFonts w:ascii="KoPub돋움체 Light" w:eastAsia="KoPub돋움체 Light" w:hAnsi="KoPub돋움체 Light" w:hint="eastAsia"/>
+          <w:rFonts w:ascii="KoPub돋움체 Light" w:eastAsia="KoPub돋움체 Light" w:hAnsi="KoPub돋움체 Light"/>
         </w:rPr>
       </w:pPr>
     </w:p>
@@ -7123,7 +7050,7 @@
         </w:pBdr>
         <w:ind w:left="600"/>
         <w:rPr>
-          <w:rFonts w:ascii="KoPub돋움체 Light" w:eastAsia="KoPub돋움체 Light" w:hAnsi="KoPub돋움체 Light" w:hint="eastAsia"/>
+          <w:rFonts w:ascii="KoPub돋움체 Light" w:eastAsia="KoPub돋움체 Light" w:hAnsi="KoPub돋움체 Light"/>
         </w:rPr>
       </w:pPr>
     </w:p>
@@ -7141,7 +7068,7 @@
           <w:between w:val="nil"/>
         </w:pBdr>
         <w:rPr>
-          <w:rFonts w:ascii="KoPub돋움체 Light" w:eastAsia="KoPub돋움체 Light" w:hAnsi="KoPub돋움체 Light" w:cs="Arial Unicode MS" w:hint="eastAsia"/>
+          <w:rFonts w:ascii="KoPub돋움체 Light" w:eastAsia="KoPub돋움체 Light" w:hAnsi="KoPub돋움체 Light" w:cs="Arial Unicode MS"/>
         </w:rPr>
       </w:pPr>
       <w:r>
@@ -7615,6 +7542,44 @@
     </w:sectPr>
   </w:body>
 </w:document>
+</file>
+
+<file path=word/endnotes.xml><?xml version="1.0" encoding="utf-8"?>
+<w:endnotes xmlns:wpc="http://schemas.microsoft.com/office/word/2010/wordprocessingCanvas" xmlns:cx="http://schemas.microsoft.com/office/drawing/2014/chartex" xmlns:cx1="http://schemas.microsoft.com/office/drawing/2015/9/8/chartex" xmlns:cx2="http://schemas.microsoft.com/office/drawing/2015/10/21/chartex" xmlns:cx3="http://schemas.microsoft.com/office/drawing/2016/5/9/chartex" xmlns:cx4="http://schemas.microsoft.com/office/drawing/2016/5/10/chartex" xmlns:cx5="http://schemas.microsoft.com/office/drawing/2016/5/11/chartex" xmlns:cx6="http://schemas.microsoft.com/office/drawing/2016/5/12/chartex" xmlns:cx7="http://schemas.microsoft.com/office/drawing/2016/5/13/chartex" xmlns:cx8="http://schemas.microsoft.com/office/drawing/2016/5/14/chartex" xmlns:mc="http://schemas.openxmlformats.org/markup-compatibility/2006" xmlns:aink="http://schemas.microsoft.com/office/drawing/2016/ink" xmlns:am3d="http://schemas.microsoft.com/office/drawing/2017/model3d" xmlns:o="urn:schemas-microsoft-com:office:office" xmlns:oel="http://schemas.microsoft.com/office/2019/extlst" xmlns:r="http://schemas.openxmlformats.org/officeDocument/2006/relationships" xmlns:m="http://schemas.openxmlformats.org/officeDocument/2006/math" xmlns:v="urn:schemas-microsoft-com:vml" xmlns:wp14="http://schemas.microsoft.com/office/word/2010/wordprocessingDrawing" xmlns:wp="http://schemas.openxmlformats.org/drawingml/2006/wordprocessingDrawing" xmlns:w10="urn:schemas-microsoft-com:office:word" xmlns:w="http://schemas.openxmlformats.org/wordprocessingml/2006/main" xmlns:w14="http://schemas.microsoft.com/office/word/2010/wordml" xmlns:w15="http://schemas.microsoft.com/office/word/2012/wordml" xmlns:w16cex="http://schemas.microsoft.com/office/word/2018/wordml/cex" xmlns:w16cid="http://schemas.microsoft.com/office/word/2016/wordml/cid" xmlns:w16="http://schemas.microsoft.com/office/word/2018/wordml" xmlns:w16du="http://schemas.microsoft.com/office/word/2023/wordml/word16du" xmlns:w16sdtdh="http://schemas.microsoft.com/office/word/2020/wordml/sdtdatahash" xmlns:w16sdtfl="http://schemas.microsoft.com/office/word/2024/wordml/sdtformatlock" xmlns:w16se="http://schemas.microsoft.com/office/word/2015/wordml/symex" xmlns:wpg="http://schemas.microsoft.com/office/word/2010/wordprocessingGroup" xmlns:wpi="http://schemas.microsoft.com/office/word/2010/wordprocessingInk" xmlns:wne="http://schemas.microsoft.com/office/word/2006/wordml" xmlns:wps="http://schemas.microsoft.com/office/word/2010/wordprocessingShape" mc:Ignorable="w14 w15 w16se w16cid w16 w16cex w16sdtdh w16sdtfl w16du wp14">
+  <w:endnote w:type="separator" w:id="-1">
+    <w:p>
+      <w:r>
+        <w:separator/>
+      </w:r>
+    </w:p>
+  </w:endnote>
+  <w:endnote w:type="continuationSeparator" w:id="0">
+    <w:p>
+      <w:r>
+        <w:continuationSeparator/>
+      </w:r>
+    </w:p>
+  </w:endnote>
+</w:endnotes>
+</file>
+
+<file path=word/footnotes.xml><?xml version="1.0" encoding="utf-8"?>
+<w:footnotes xmlns:wpc="http://schemas.microsoft.com/office/word/2010/wordprocessingCanvas" xmlns:cx="http://schemas.microsoft.com/office/drawing/2014/chartex" xmlns:cx1="http://schemas.microsoft.com/office/drawing/2015/9/8/chartex" xmlns:cx2="http://schemas.microsoft.com/office/drawing/2015/10/21/chartex" xmlns:cx3="http://schemas.microsoft.com/office/drawing/2016/5/9/chartex" xmlns:cx4="http://schemas.microsoft.com/office/drawing/2016/5/10/chartex" xmlns:cx5="http://schemas.microsoft.com/office/drawing/2016/5/11/chartex" xmlns:cx6="http://schemas.microsoft.com/office/drawing/2016/5/12/chartex" xmlns:cx7="http://schemas.microsoft.com/office/drawing/2016/5/13/chartex" xmlns:cx8="http://schemas.microsoft.com/office/drawing/2016/5/14/chartex" xmlns:mc="http://schemas.openxmlformats.org/markup-compatibility/2006" xmlns:aink="http://schemas.microsoft.com/office/drawing/2016/ink" xmlns:am3d="http://schemas.microsoft.com/office/drawing/2017/model3d" xmlns:o="urn:schemas-microsoft-com:office:office" xmlns:oel="http://schemas.microsoft.com/office/2019/extlst" xmlns:r="http://schemas.openxmlformats.org/officeDocument/2006/relationships" xmlns:m="http://schemas.openxmlformats.org/officeDocument/2006/math" xmlns:v="urn:schemas-microsoft-com:vml" xmlns:wp14="http://schemas.microsoft.com/office/word/2010/wordprocessingDrawing" xmlns:wp="http://schemas.openxmlformats.org/drawingml/2006/wordprocessingDrawing" xmlns:w10="urn:schemas-microsoft-com:office:word" xmlns:w="http://schemas.openxmlformats.org/wordprocessingml/2006/main" xmlns:w14="http://schemas.microsoft.com/office/word/2010/wordml" xmlns:w15="http://schemas.microsoft.com/office/word/2012/wordml" xmlns:w16cex="http://schemas.microsoft.com/office/word/2018/wordml/cex" xmlns:w16cid="http://schemas.microsoft.com/office/word/2016/wordml/cid" xmlns:w16="http://schemas.microsoft.com/office/word/2018/wordml" xmlns:w16du="http://schemas.microsoft.com/office/word/2023/wordml/word16du" xmlns:w16sdtdh="http://schemas.microsoft.com/office/word/2020/wordml/sdtdatahash" xmlns:w16sdtfl="http://schemas.microsoft.com/office/word/2024/wordml/sdtformatlock" xmlns:w16se="http://schemas.microsoft.com/office/word/2015/wordml/symex" xmlns:wpg="http://schemas.microsoft.com/office/word/2010/wordprocessingGroup" xmlns:wpi="http://schemas.microsoft.com/office/word/2010/wordprocessingInk" xmlns:wne="http://schemas.microsoft.com/office/word/2006/wordml" xmlns:wps="http://schemas.microsoft.com/office/word/2010/wordprocessingShape" mc:Ignorable="w14 w15 w16se w16cid w16 w16cex w16sdtdh w16sdtfl w16du wp14">
+  <w:footnote w:type="separator" w:id="-1">
+    <w:p>
+      <w:r>
+        <w:separator/>
+      </w:r>
+    </w:p>
+  </w:footnote>
+  <w:footnote w:type="continuationSeparator" w:id="0">
+    <w:p>
+      <w:r>
+        <w:continuationSeparator/>
+      </w:r>
+    </w:p>
+  </w:footnote>
+</w:footnotes>
 </file>
 
 <file path=word/numbering.xml><?xml version="1.0" encoding="utf-8"?>
@@ -9743,6 +9708,7 @@
   <w:style w:type="character" w:default="1" w:styleId="a0">
     <w:name w:val="Default Paragraph Font"/>
     <w:uiPriority w:val="1"/>
+    <w:semiHidden/>
     <w:unhideWhenUsed/>
   </w:style>
   <w:style w:type="table" w:default="1" w:styleId="a1">
@@ -9852,6 +9818,50 @@
     <w:pPr>
       <w:ind w:leftChars="400" w:left="800"/>
     </w:pPr>
+  </w:style>
+  <w:style w:type="paragraph" w:styleId="aa">
+    <w:name w:val="header"/>
+    <w:basedOn w:val="a"/>
+    <w:link w:val="Char"/>
+    <w:uiPriority w:val="99"/>
+    <w:unhideWhenUsed/>
+    <w:rsid w:val="00E34BCB"/>
+    <w:pPr>
+      <w:tabs>
+        <w:tab w:val="center" w:pos="4513"/>
+        <w:tab w:val="right" w:pos="9026"/>
+      </w:tabs>
+      <w:snapToGrid w:val="0"/>
+    </w:pPr>
+  </w:style>
+  <w:style w:type="character" w:customStyle="1" w:styleId="Char">
+    <w:name w:val="머리글 Char"/>
+    <w:basedOn w:val="a0"/>
+    <w:link w:val="aa"/>
+    <w:uiPriority w:val="99"/>
+    <w:rsid w:val="00E34BCB"/>
+  </w:style>
+  <w:style w:type="paragraph" w:styleId="ab">
+    <w:name w:val="footer"/>
+    <w:basedOn w:val="a"/>
+    <w:link w:val="Char0"/>
+    <w:uiPriority w:val="99"/>
+    <w:unhideWhenUsed/>
+    <w:rsid w:val="00E34BCB"/>
+    <w:pPr>
+      <w:tabs>
+        <w:tab w:val="center" w:pos="4513"/>
+        <w:tab w:val="right" w:pos="9026"/>
+      </w:tabs>
+      <w:snapToGrid w:val="0"/>
+    </w:pPr>
+  </w:style>
+  <w:style w:type="character" w:customStyle="1" w:styleId="Char0">
+    <w:name w:val="바닥글 Char"/>
+    <w:basedOn w:val="a0"/>
+    <w:link w:val="ab"/>
+    <w:uiPriority w:val="99"/>
+    <w:rsid w:val="00E34BCB"/>
   </w:style>
 </w:styles>
 </file>

</xml_diff>

<commit_message>
docs: update final paper files and documents (KO/EN docx, pdf, md)
</commit_message>
<xml_diff>
--- a/docs/FIDO2_PoP_Gateway.docx
+++ b/docs/FIDO2_PoP_Gateway.docx
@@ -4,25 +4,29 @@
   <w:body>
     <w:p>
       <w:pPr>
-        <w:spacing w:before="2400" w:after="0"/>
-      </w:pPr>
-    </w:p>
-    <w:p>
-      <w:pPr>
+        <w:spacing w:before="2400"/>
+        <w:rPr>
+          <w:rFonts w:ascii="KoPub돋움체 Light" w:eastAsia="KoPub돋움체 Light" w:hAnsi="KoPub돋움체 Light"/>
+        </w:rPr>
+      </w:pPr>
+    </w:p>
+    <w:p>
+      <w:pPr>
+        <w:spacing w:after="280"/>
         <w:jc w:val="center"/>
-        <w:spacing w:before="0" w:after="280"/>
-      </w:pPr>
-      <w:r>
-        <w:rPr>
-          <w:rFonts w:eastAsia="맑은 고딕" w:ascii="Calibri"/>
+        <w:rPr>
+          <w:rFonts w:ascii="KoPub돋움체 Bold" w:eastAsia="KoPub돋움체 Bold" w:hAnsi="KoPub돋움체 Bold"/>
+        </w:rPr>
+      </w:pPr>
+      <w:r>
+        <w:rPr>
+          <w:rFonts w:ascii="KoPub돋움체 Bold" w:eastAsia="KoPub돋움체 Bold" w:hAnsi="KoPub돋움체 Bold"/>
           <w:b/>
+          <w:color w:val="1E3A5F"/>
           <w:sz w:val="44"/>
           <w:szCs w:val="44"/>
-          <w:color w:val="1E3A5F"/>
-        </w:rPr>
-        <w:t xml:space="preserve">FIDO2 하드웨어 격리 키 기반
-Proof-of-Possession 역방향 프록시 게이트웨이의
-설계 및 성능 분석</w:t>
+        </w:rPr>
+        <w:t>FIDO2 하드웨어 격리 키 기반 Proof-of-Possession 역방향 프록시 게이트웨이의 설계 및 성능 분석</w:t>
       </w:r>
     </w:p>
     <w:p>
@@ -30,67 +34,86 @@
         <w:pBdr>
           <w:bottom w:val="single" w:sz="6" w:space="1" w:color="2563EB"/>
         </w:pBdr>
-      </w:pPr>
-    </w:p>
-    <w:p>
-      <w:pPr>
-        <w:spacing w:before="480" w:after="0"/>
-      </w:pPr>
-    </w:p>
-    <w:p>
-      <w:pPr>
+        <w:rPr>
+          <w:rFonts w:ascii="KoPub돋움체 Light" w:eastAsia="KoPub돋움체 Light" w:hAnsi="KoPub돋움체 Light"/>
+        </w:rPr>
+      </w:pPr>
+    </w:p>
+    <w:p>
+      <w:pPr>
+        <w:spacing w:before="480"/>
+        <w:rPr>
+          <w:rFonts w:ascii="KoPub돋움체 Light" w:eastAsia="KoPub돋움체 Light" w:hAnsi="KoPub돋움체 Light"/>
+        </w:rPr>
+      </w:pPr>
+    </w:p>
+    <w:p>
+      <w:pPr>
+        <w:spacing w:after="400"/>
         <w:jc w:val="center"/>
-        <w:spacing w:before="0" w:after="400"/>
-      </w:pPr>
-      <w:r>
-        <w:rPr>
-          <w:rFonts w:eastAsia="맑은 고딕" w:ascii="Calibri"/>
+        <w:rPr>
+          <w:rFonts w:ascii="KoPub돋움체 Light" w:eastAsia="KoPub돋움체 Light" w:hAnsi="KoPub돋움체 Light"/>
+        </w:rPr>
+      </w:pPr>
+      <w:r>
+        <w:rPr>
+          <w:rFonts w:ascii="KoPub돋움체 Light" w:eastAsia="KoPub돋움체 Light" w:hAnsi="KoPub돋움체 Light"/>
+          <w:color w:val="4B5563"/>
           <w:sz w:val="26"/>
           <w:szCs w:val="26"/>
-          <w:color w:val="4B5563"/>
-        </w:rPr>
-        <w:t xml:space="preserve">웹 API 보안 및 하드웨어 암호 기반 인증 프로토콜</w:t>
-      </w:r>
-    </w:p>
-    <w:p>
-      <w:pPr>
-        <w:spacing w:before="800" w:after="0"/>
+        </w:rPr>
+        <w:t>웹 API 보안 및 하드웨어 암호 기반 인증 프로토콜</w:t>
+      </w:r>
+    </w:p>
+    <w:p>
+      <w:pPr>
+        <w:spacing w:before="800"/>
+        <w:rPr>
+          <w:rFonts w:ascii="KoPub돋움체 Light" w:eastAsia="KoPub돋움체 Light" w:hAnsi="KoPub돋움체 Light"/>
+        </w:rPr>
       </w:pPr>
     </w:p>
     <w:p>
       <w:pPr>
         <w:jc w:val="center"/>
-        <w:spacing w:before="0" w:after="0"/>
-      </w:pPr>
-      <w:r>
-        <w:rPr>
-          <w:rFonts w:eastAsia="맑은 고딕" w:ascii="Calibri"/>
+        <w:rPr>
+          <w:rFonts w:ascii="KoPub돋움체 Light" w:eastAsia="KoPub돋움체 Light" w:hAnsi="KoPub돋움체 Light"/>
+        </w:rPr>
+      </w:pPr>
+      <w:r>
+        <w:rPr>
+          <w:rFonts w:ascii="KoPub돋움체 Light" w:eastAsia="KoPub돋움체 Light" w:hAnsi="KoPub돋움체 Light"/>
           <w:b/>
+          <w:color w:val="1E3A5F"/>
           <w:sz w:val="28"/>
           <w:szCs w:val="28"/>
-          <w:color w:val="1E3A5F"/>
-        </w:rPr>
-        <w:t xml:space="preserve">작성자: 강아름</w:t>
-      </w:r>
-    </w:p>
-    <w:p>
-      <w:pPr>
-        <w:spacing w:before="160" w:after="0"/>
+        </w:rPr>
+        <w:t>작성자: 강아름</w:t>
+      </w:r>
+    </w:p>
+    <w:p>
+      <w:pPr>
+        <w:spacing w:before="160"/>
+        <w:rPr>
+          <w:rFonts w:ascii="KoPub돋움체 Light" w:eastAsia="KoPub돋움체 Light" w:hAnsi="KoPub돋움체 Light"/>
+        </w:rPr>
       </w:pPr>
     </w:p>
     <w:p>
       <w:pPr>
         <w:jc w:val="center"/>
-        <w:spacing w:before="0" w:after="0"/>
-      </w:pPr>
-      <w:r>
-        <w:rPr>
-          <w:rFonts w:eastAsia="맑은 고딕" w:ascii="Calibri"/>
+        <w:rPr>
+          <w:rFonts w:ascii="KoPub돋움체 Light" w:eastAsia="KoPub돋움체 Light" w:hAnsi="KoPub돋움체 Light"/>
+        </w:rPr>
+      </w:pPr>
+      <w:r>
+        <w:rPr>
+          <w:rFonts w:ascii="KoPub돋움체 Light" w:eastAsia="KoPub돋움체 Light" w:hAnsi="KoPub돋움체 Light"/>
+          <w:color w:val="374151"/>
           <w:sz w:val="26"/>
           <w:szCs w:val="26"/>
-          <w:color w:val="374151"/>
-        </w:rPr>
-        <w:t xml:space="preserve">작성일: 2026년 9월 8일</w:t>
+        </w:rPr>
+        <w:t>작성일: 2026년 9월 8일</w:t>
       </w:r>
     </w:p>
     <w:p>
@@ -106,12 +129,13 @@
           <w:rFonts w:ascii="KoPub돋움체 Light" w:eastAsia="KoPub돋움체 Light" w:hAnsi="KoPub돋움체 Light" w:cs="Arial Unicode MS"/>
         </w:rPr>
       </w:pPr>
-      <w:bookmarkStart w:id="2" w:name="_jp5mp33j64xx" w:colFirst="0" w:colLast="0"/>
-      <w:bookmarkEnd w:id="2"/>
-      <w:r>
-        <w:rPr>
-          <w:rFonts w:ascii="KoPub돋움체 Light" w:eastAsia="KoPub돋움체 Light" w:hAnsi="KoPub돋움체 Light" w:cs="Arial Unicode MS"/>
-        </w:rPr>
+      <w:bookmarkStart w:id="0" w:name="_jp5mp33j64xx" w:colFirst="0" w:colLast="0"/>
+      <w:bookmarkEnd w:id="0"/>
+      <w:r>
+        <w:rPr>
+          <w:rFonts w:ascii="KoPub돋움체 Light" w:eastAsia="KoPub돋움체 Light" w:hAnsi="KoPub돋움체 Light" w:cs="Arial Unicode MS"/>
+        </w:rPr>
+        <w:lastRenderedPageBreak/>
         <w:t>초록</w:t>
       </w:r>
     </w:p>
@@ -222,8 +246,8 @@
           <w:rFonts w:ascii="KoPub돋움체 Light" w:eastAsia="KoPub돋움체 Light" w:hAnsi="KoPub돋움체 Light" w:cs="Arial Unicode MS"/>
         </w:rPr>
       </w:pPr>
-      <w:bookmarkStart w:id="3" w:name="_8rflvs2gdn72" w:colFirst="0" w:colLast="0"/>
-      <w:bookmarkEnd w:id="3"/>
+      <w:bookmarkStart w:id="1" w:name="_8rflvs2gdn72" w:colFirst="0" w:colLast="0"/>
+      <w:bookmarkEnd w:id="1"/>
       <w:r>
         <w:rPr>
           <w:rFonts w:ascii="KoPub돋움체 Light" w:eastAsia="KoPub돋움체 Light" w:hAnsi="KoPub돋움체 Light" w:cs="Arial Unicode MS"/>
@@ -390,7 +414,6 @@
         <w:rPr>
           <w:rFonts w:ascii="KoPub돋움체 Light" w:eastAsia="KoPub돋움체 Light" w:hAnsi="KoPub돋움체 Light" w:cs="Arial Unicode MS"/>
         </w:rPr>
-        <w:lastRenderedPageBreak/>
         <w:t xml:space="preserve">본 연구에서는 하드웨어 격리 장치에 개인키를 보관하는 FIDO2 규격을 역방향 프록시 게이트웨이와 결합하는 아키텍처를 제안한다. 클라이언트는 하드웨어 칩셋 내부에서 생성한 디지털 서명을 HTTP 헤더에 부착하여 전송하며, 게이트웨이는 요청 중계 전 서명의 유효성을 검증하여 세션 </w:t>
       </w:r>
       <w:proofErr w:type="spellStart"/>
@@ -545,6 +568,7 @@
         <w:rPr>
           <w:rFonts w:ascii="KoPub돋움체 Light" w:eastAsia="KoPub돋움체 Light" w:hAnsi="KoPub돋움체 Light" w:cs="Arial Unicode MS"/>
         </w:rPr>
+        <w:lastRenderedPageBreak/>
         <w:t xml:space="preserve">자원 제어 및 동시성 최적화 아키텍처 설계: 대용량 요청 본문의 메모리 부하를 방지하는 스트리밍 다이제스트 구조를 설계하였다. 또한 비인가 대량 트래픽 차단을 위해 O(1) 시간 복잡도의 </w:t>
       </w:r>
       <w:proofErr w:type="spellStart"/>
@@ -623,8 +647,8 @@
           <w:rFonts w:ascii="KoPub돋움체 Light" w:eastAsia="KoPub돋움체 Light" w:hAnsi="KoPub돋움체 Light"/>
         </w:rPr>
       </w:pPr>
-      <w:bookmarkStart w:id="4" w:name="_wht0okxd73gp" w:colFirst="0" w:colLast="0"/>
-      <w:bookmarkEnd w:id="4"/>
+      <w:bookmarkStart w:id="2" w:name="_wht0okxd73gp" w:colFirst="0" w:colLast="0"/>
+      <w:bookmarkEnd w:id="2"/>
       <w:r>
         <w:rPr>
           <w:rFonts w:ascii="KoPub돋움체 Light" w:eastAsia="KoPub돋움체 Light" w:hAnsi="KoPub돋움체 Light" w:cs="Arial Unicode MS"/>
@@ -640,8 +664,8 @@
           <w:rFonts w:ascii="KoPub돋움체 Light" w:eastAsia="KoPub돋움체 Light" w:hAnsi="KoPub돋움체 Light" w:cs="Arial Unicode MS"/>
         </w:rPr>
       </w:pPr>
-      <w:bookmarkStart w:id="5" w:name="_937x26aopzf0" w:colFirst="0" w:colLast="0"/>
-      <w:bookmarkEnd w:id="5"/>
+      <w:bookmarkStart w:id="3" w:name="_937x26aopzf0" w:colFirst="0" w:colLast="0"/>
+      <w:bookmarkEnd w:id="3"/>
       <w:r>
         <w:rPr>
           <w:rFonts w:ascii="KoPub돋움체 Light" w:eastAsia="KoPub돋움체 Light" w:hAnsi="KoPub돋움체 Light" w:cs="Arial Unicode MS"/>
@@ -858,8 +882,8 @@
           <w:rFonts w:ascii="KoPub돋움체 Light" w:eastAsia="KoPub돋움체 Light" w:hAnsi="KoPub돋움체 Light" w:cs="Arial Unicode MS"/>
         </w:rPr>
       </w:pPr>
-      <w:bookmarkStart w:id="6" w:name="_b7u93h5r1q88" w:colFirst="0" w:colLast="0"/>
-      <w:bookmarkEnd w:id="6"/>
+      <w:bookmarkStart w:id="4" w:name="_b7u93h5r1q88" w:colFirst="0" w:colLast="0"/>
+      <w:bookmarkEnd w:id="4"/>
       <w:r>
         <w:rPr>
           <w:rFonts w:ascii="KoPub돋움체 Light" w:eastAsia="KoPub돋움체 Light" w:hAnsi="KoPub돋움체 Light" w:cs="Arial Unicode MS"/>
@@ -928,14 +952,7 @@
         <w:rPr>
           <w:rFonts w:ascii="KoPub돋움체 Light" w:eastAsia="KoPub돋움체 Light" w:hAnsi="KoPub돋움체 Light" w:cs="Arial Unicode MS"/>
         </w:rPr>
-        <w:t xml:space="preserve">(Secure </w:t>
-      </w:r>
-      <w:r>
-        <w:rPr>
-          <w:rFonts w:ascii="KoPub돋움체 Light" w:eastAsia="KoPub돋움체 Light" w:hAnsi="KoPub돋움체 Light" w:cs="Arial Unicode MS"/>
-        </w:rPr>
-        <w:lastRenderedPageBreak/>
-        <w:t>Enclave), 외장형 보안 토큰을 하드웨어 인증기로 사용한다.</w:t>
+        <w:t>(Secure Enclave), 외장형 보안 토큰을 하드웨어 인증기로 사용한다.</w:t>
       </w:r>
     </w:p>
     <w:p>
@@ -1012,8 +1029,8 @@
           <w:rFonts w:ascii="KoPub돋움체 Light" w:eastAsia="KoPub돋움체 Light" w:hAnsi="KoPub돋움체 Light" w:cs="Arial Unicode MS"/>
         </w:rPr>
       </w:pPr>
-      <w:bookmarkStart w:id="7" w:name="_810wtrw8ks97" w:colFirst="0" w:colLast="0"/>
-      <w:bookmarkEnd w:id="7"/>
+      <w:bookmarkStart w:id="5" w:name="_810wtrw8ks97" w:colFirst="0" w:colLast="0"/>
+      <w:bookmarkEnd w:id="5"/>
       <w:r>
         <w:rPr>
           <w:rFonts w:ascii="KoPub돋움체 Light" w:eastAsia="KoPub돋움체 Light" w:hAnsi="KoPub돋움체 Light" w:cs="Arial Unicode MS"/>
@@ -1790,8 +1807,8 @@
           <w:rFonts w:ascii="KoPub돋움체 Light" w:eastAsia="KoPub돋움체 Light" w:hAnsi="KoPub돋움체 Light"/>
         </w:rPr>
       </w:pPr>
-      <w:bookmarkStart w:id="8" w:name="_3tfu1a9xnmrp" w:colFirst="0" w:colLast="0"/>
-      <w:bookmarkEnd w:id="8"/>
+      <w:bookmarkStart w:id="6" w:name="_3tfu1a9xnmrp" w:colFirst="0" w:colLast="0"/>
+      <w:bookmarkEnd w:id="6"/>
       <w:r>
         <w:rPr>
           <w:rFonts w:ascii="KoPub돋움체 Light" w:eastAsia="KoPub돋움체 Light" w:hAnsi="KoPub돋움체 Light" w:cs="Arial Unicode MS"/>
@@ -1807,8 +1824,8 @@
           <w:rFonts w:ascii="KoPub돋움체 Light" w:eastAsia="KoPub돋움체 Light" w:hAnsi="KoPub돋움체 Light" w:cs="Arial Unicode MS"/>
         </w:rPr>
       </w:pPr>
-      <w:bookmarkStart w:id="9" w:name="_520vgsyx2gg" w:colFirst="0" w:colLast="0"/>
-      <w:bookmarkEnd w:id="9"/>
+      <w:bookmarkStart w:id="7" w:name="_520vgsyx2gg" w:colFirst="0" w:colLast="0"/>
+      <w:bookmarkEnd w:id="7"/>
       <w:r>
         <w:rPr>
           <w:rFonts w:ascii="KoPub돋움체 Light" w:eastAsia="KoPub돋움체 Light" w:hAnsi="KoPub돋움체 Light" w:cs="Arial Unicode MS"/>
@@ -1891,8 +1908,8 @@
           <w:rFonts w:ascii="KoPub돋움체 Light" w:eastAsia="KoPub돋움체 Light" w:hAnsi="KoPub돋움체 Light" w:cs="Arial Unicode MS"/>
         </w:rPr>
       </w:pPr>
-      <w:bookmarkStart w:id="10" w:name="_hf3gklharjr1" w:colFirst="0" w:colLast="0"/>
-      <w:bookmarkEnd w:id="10"/>
+      <w:bookmarkStart w:id="8" w:name="_hf3gklharjr1" w:colFirst="0" w:colLast="0"/>
+      <w:bookmarkEnd w:id="8"/>
       <w:r>
         <w:rPr>
           <w:rFonts w:ascii="KoPub돋움체 Light" w:eastAsia="KoPub돋움체 Light" w:hAnsi="KoPub돋움체 Light" w:cs="Arial Unicode MS"/>
@@ -1905,6 +1922,7 @@
         <w:rPr>
           <w:rFonts w:hint="eastAsia"/>
         </w:rPr>
+        <w:lastRenderedPageBreak/>
         <w:t>]</w:t>
       </w:r>
     </w:p>
@@ -2106,8 +2124,8 @@
           <w:rFonts w:ascii="KoPub돋움체 Light" w:eastAsia="KoPub돋움체 Light" w:hAnsi="KoPub돋움체 Light"/>
         </w:rPr>
       </w:pPr>
-      <w:bookmarkStart w:id="11" w:name="_x5en3fvyddrx" w:colFirst="0" w:colLast="0"/>
-      <w:bookmarkEnd w:id="11"/>
+      <w:bookmarkStart w:id="9" w:name="_x5en3fvyddrx" w:colFirst="0" w:colLast="0"/>
+      <w:bookmarkEnd w:id="9"/>
       <w:r>
         <w:rPr>
           <w:rFonts w:ascii="KoPub돋움체 Light" w:eastAsia="KoPub돋움체 Light" w:hAnsi="KoPub돋움체 Light" w:cs="Arial Unicode MS"/>
@@ -2123,8 +2141,8 @@
           <w:rFonts w:ascii="KoPub돋움체 Light" w:eastAsia="KoPub돋움체 Light" w:hAnsi="KoPub돋움체 Light"/>
         </w:rPr>
       </w:pPr>
-      <w:bookmarkStart w:id="12" w:name="_2qct6b40lszp" w:colFirst="0" w:colLast="0"/>
-      <w:bookmarkEnd w:id="12"/>
+      <w:bookmarkStart w:id="10" w:name="_2qct6b40lszp" w:colFirst="0" w:colLast="0"/>
+      <w:bookmarkEnd w:id="10"/>
       <w:r>
         <w:rPr>
           <w:rFonts w:ascii="KoPub돋움체 Light" w:eastAsia="KoPub돋움체 Light" w:hAnsi="KoPub돋움체 Light" w:cs="Arial Unicode MS"/>
@@ -2142,122 +2160,8 @@
           <w:between w:val="nil"/>
         </w:pBdr>
         <w:spacing w:after="240"/>
-        <w:ind w:firstLine="720"/>
-        <w:rPr>
-          <w:rFonts w:ascii="KoPub돋움체 Light" w:eastAsia="KoPub돋움체 Light" w:hAnsi="KoPub돋움체 Light" w:cs="Arial Unicode MS"/>
-        </w:rPr>
-      </w:pPr>
-      <w:r>
-        <w:rPr>
-          <w:rFonts w:ascii="KoPub돋움체 Light" w:eastAsia="KoPub돋움체 Light" w:hAnsi="KoPub돋움체 Light" w:cs="Arial Unicode MS" w:hint="eastAsia"/>
-        </w:rPr>
-        <w:t xml:space="preserve">제안하는 시스템은 사용자 로컬 디바이스의 하드웨어 보안 영역과 서버 측 L7 역방향 프록시 게이트웨이로 구성된다. 클라이언트는 브라우저 소프트웨어와 메인보드에 결합된 하드웨어 칩셋을 포함하고, 서버 인프라는 </w:t>
-      </w:r>
-      <w:proofErr w:type="spellStart"/>
-      <w:r>
-        <w:rPr>
-          <w:rFonts w:ascii="KoPub돋움체 Light" w:eastAsia="KoPub돋움체 Light" w:hAnsi="KoPub돋움체 Light" w:cs="Arial Unicode MS" w:hint="eastAsia"/>
-        </w:rPr>
-        <w:t>FastAPI</w:t>
-      </w:r>
-      <w:proofErr w:type="spellEnd"/>
-      <w:r>
-        <w:rPr>
-          <w:rFonts w:ascii="KoPub돋움체 Light" w:eastAsia="KoPub돋움체 Light" w:hAnsi="KoPub돋움체 Light" w:cs="Arial Unicode MS" w:hint="eastAsia"/>
-        </w:rPr>
-        <w:t xml:space="preserve"> 기반의 역방향 프록시 게이트웨이와 </w:t>
-      </w:r>
-      <w:proofErr w:type="spellStart"/>
-      <w:r>
-        <w:rPr>
-          <w:rFonts w:ascii="KoPub돋움체 Light" w:eastAsia="KoPub돋움체 Light" w:hAnsi="KoPub돋움체 Light" w:cs="Arial Unicode MS" w:hint="eastAsia"/>
-        </w:rPr>
-        <w:t>백엔드</w:t>
-      </w:r>
-      <w:proofErr w:type="spellEnd"/>
-      <w:r>
-        <w:rPr>
-          <w:rFonts w:ascii="KoPub돋움체 Light" w:eastAsia="KoPub돋움체 Light" w:hAnsi="KoPub돋움체 Light" w:cs="Arial Unicode MS" w:hint="eastAsia"/>
-        </w:rPr>
-        <w:t xml:space="preserve"> </w:t>
-      </w:r>
-      <w:proofErr w:type="spellStart"/>
-      <w:r>
-        <w:rPr>
-          <w:rFonts w:ascii="KoPub돋움체 Light" w:eastAsia="KoPub돋움체 Light" w:hAnsi="KoPub돋움체 Light" w:cs="Arial Unicode MS" w:hint="eastAsia"/>
-        </w:rPr>
-        <w:t>업스트림</w:t>
-      </w:r>
-      <w:proofErr w:type="spellEnd"/>
-      <w:r>
-        <w:rPr>
-          <w:rFonts w:ascii="KoPub돋움체 Light" w:eastAsia="KoPub돋움체 Light" w:hAnsi="KoPub돋움체 Light" w:cs="Arial Unicode MS" w:hint="eastAsia"/>
-        </w:rPr>
-        <w:t xml:space="preserve"> 서비스로 구성된다.</w:t>
-      </w:r>
-    </w:p>
-    <w:p>
-      <w:pPr>
-        <w:pBdr>
-          <w:top w:val="nil"/>
-          <w:left w:val="nil"/>
-          <w:bottom w:val="nil"/>
-          <w:right w:val="nil"/>
-          <w:between w:val="nil"/>
-        </w:pBdr>
-        <w:spacing w:after="240"/>
-        <w:ind w:firstLineChars="100" w:firstLine="198"/>
-        <w:rPr>
-          <w:rFonts w:ascii="KoPub돋움체 Light" w:eastAsia="KoPub돋움체 Light" w:hAnsi="KoPub돋움체 Light"/>
-        </w:rPr>
-      </w:pPr>
-      <w:r>
-        <w:rPr>
-          <w:rFonts w:ascii="KoPub돋움체 Light" w:eastAsia="KoPub돋움체 Light" w:hAnsi="KoPub돋움체 Light" w:cs="Arial Unicode MS"/>
-        </w:rPr>
-        <w:t xml:space="preserve">클라이언트는 인증 절차를 거쳐 JWT와 일회용 난수를 차례로 수신한다. 이후 HTTP 요청 컨텍스트를 </w:t>
-      </w:r>
-      <w:proofErr w:type="spellStart"/>
-      <w:r>
-        <w:rPr>
-          <w:rFonts w:ascii="KoPub돋움체 Light" w:eastAsia="KoPub돋움체 Light" w:hAnsi="KoPub돋움체 Light" w:cs="Arial Unicode MS"/>
-        </w:rPr>
-        <w:t>직렬화하여</w:t>
-      </w:r>
-      <w:proofErr w:type="spellEnd"/>
-      <w:r>
-        <w:rPr>
-          <w:rFonts w:ascii="KoPub돋움체 Light" w:eastAsia="KoPub돋움체 Light" w:hAnsi="KoPub돋움체 Light" w:cs="Arial Unicode MS"/>
-        </w:rPr>
-        <w:t xml:space="preserve"> 하드웨어 칩셋에 전달하고, 내부 논리회로에서 생성된 디지털 서명을 수신하여 요청 헤더에 첨부한다. 게이트웨이는 인입된 패킷을 검증한 뒤 유효한 요청에 한하여 </w:t>
-      </w:r>
-      <w:proofErr w:type="spellStart"/>
-      <w:r>
-        <w:rPr>
-          <w:rFonts w:ascii="KoPub돋움체 Light" w:eastAsia="KoPub돋움체 Light" w:hAnsi="KoPub돋움체 Light" w:cs="Arial Unicode MS"/>
-        </w:rPr>
-        <w:t>업스트림</w:t>
-      </w:r>
-      <w:proofErr w:type="spellEnd"/>
-      <w:r>
-        <w:rPr>
-          <w:rFonts w:ascii="KoPub돋움체 Light" w:eastAsia="KoPub돋움체 Light" w:hAnsi="KoPub돋움체 Light" w:cs="Arial Unicode MS"/>
-        </w:rPr>
-        <w:t xml:space="preserve"> 서비스로 중계한다.</w:t>
-      </w:r>
-    </w:p>
-    <w:p>
-      <w:pPr>
-        <w:pBdr>
-          <w:top w:val="nil"/>
-          <w:left w:val="nil"/>
-          <w:bottom w:val="nil"/>
-          <w:right w:val="nil"/>
-          <w:between w:val="nil"/>
-        </w:pBdr>
-        <w:spacing w:after="240"/>
-        <w:rPr>
-          <w:rFonts w:ascii="KoPub돋움체 Light" w:eastAsia="KoPub돋움체 Light" w:hAnsi="KoPub돋움체 Light"/>
+        <w:rPr>
+          <w:rFonts w:ascii="KoPub돋움체 Light" w:eastAsia="KoPub돋움체 Light" w:hAnsi="KoPub돋움체 Light" w:cs="Arial Unicode MS"/>
         </w:rPr>
       </w:pPr>
       <w:r>
@@ -2265,9 +2169,8 @@
           <w:rFonts w:ascii="KoPub돋움체 Light" w:eastAsia="KoPub돋움체 Light" w:hAnsi="KoPub돋움체 Light" w:cs="Arial Unicode MS"/>
           <w:noProof/>
         </w:rPr>
-        <w:lastRenderedPageBreak/>
         <w:drawing>
-          <wp:inline distT="0" distB="0" distL="0" distR="0" wp14:anchorId="480F2445" wp14:editId="07EF45BC">
+          <wp:inline distT="0" distB="0" distL="0" distR="0" wp14:anchorId="2E1C969B" wp14:editId="19CA8DA8">
             <wp:extent cx="5934075" cy="4067175"/>
             <wp:effectExtent l="0" t="0" r="9525" b="9525"/>
             <wp:docPr id="1" name="그림 1"/>
@@ -2326,8 +2229,123 @@
           <w:between w:val="nil"/>
         </w:pBdr>
         <w:spacing w:after="240"/>
-        <w:rPr>
-          <w:rFonts w:ascii="KoPub돋움체 Light" w:eastAsia="KoPub돋움체 Light" w:hAnsi="KoPub돋움체 Light"/>
+        <w:ind w:firstLine="720"/>
+        <w:rPr>
+          <w:rFonts w:ascii="KoPub돋움체 Light" w:eastAsia="KoPub돋움체 Light" w:hAnsi="KoPub돋움체 Light" w:cs="Arial Unicode MS"/>
+        </w:rPr>
+      </w:pPr>
+      <w:r>
+        <w:rPr>
+          <w:rFonts w:ascii="KoPub돋움체 Light" w:eastAsia="KoPub돋움체 Light" w:hAnsi="KoPub돋움체 Light" w:cs="Arial Unicode MS" w:hint="eastAsia"/>
+        </w:rPr>
+        <w:lastRenderedPageBreak/>
+        <w:t xml:space="preserve">제안하는 시스템은 사용자 로컬 디바이스의 하드웨어 보안 영역과 서버 측 L7 역방향 프록시 게이트웨이로 구성된다. 클라이언트는 브라우저 소프트웨어와 메인보드에 결합된 하드웨어 칩셋을 포함하고, 서버 인프라는 </w:t>
+      </w:r>
+      <w:proofErr w:type="spellStart"/>
+      <w:r>
+        <w:rPr>
+          <w:rFonts w:ascii="KoPub돋움체 Light" w:eastAsia="KoPub돋움체 Light" w:hAnsi="KoPub돋움체 Light" w:cs="Arial Unicode MS" w:hint="eastAsia"/>
+        </w:rPr>
+        <w:t>FastAPI</w:t>
+      </w:r>
+      <w:proofErr w:type="spellEnd"/>
+      <w:r>
+        <w:rPr>
+          <w:rFonts w:ascii="KoPub돋움체 Light" w:eastAsia="KoPub돋움체 Light" w:hAnsi="KoPub돋움체 Light" w:cs="Arial Unicode MS" w:hint="eastAsia"/>
+        </w:rPr>
+        <w:t xml:space="preserve"> 기반의 역방향 프록시 게이트웨이와 </w:t>
+      </w:r>
+      <w:proofErr w:type="spellStart"/>
+      <w:r>
+        <w:rPr>
+          <w:rFonts w:ascii="KoPub돋움체 Light" w:eastAsia="KoPub돋움체 Light" w:hAnsi="KoPub돋움체 Light" w:cs="Arial Unicode MS" w:hint="eastAsia"/>
+        </w:rPr>
+        <w:t>백엔드</w:t>
+      </w:r>
+      <w:proofErr w:type="spellEnd"/>
+      <w:r>
+        <w:rPr>
+          <w:rFonts w:ascii="KoPub돋움체 Light" w:eastAsia="KoPub돋움체 Light" w:hAnsi="KoPub돋움체 Light" w:cs="Arial Unicode MS" w:hint="eastAsia"/>
+        </w:rPr>
+        <w:t xml:space="preserve"> </w:t>
+      </w:r>
+      <w:proofErr w:type="spellStart"/>
+      <w:r>
+        <w:rPr>
+          <w:rFonts w:ascii="KoPub돋움체 Light" w:eastAsia="KoPub돋움체 Light" w:hAnsi="KoPub돋움체 Light" w:cs="Arial Unicode MS" w:hint="eastAsia"/>
+        </w:rPr>
+        <w:t>업스트림</w:t>
+      </w:r>
+      <w:proofErr w:type="spellEnd"/>
+      <w:r>
+        <w:rPr>
+          <w:rFonts w:ascii="KoPub돋움체 Light" w:eastAsia="KoPub돋움체 Light" w:hAnsi="KoPub돋움체 Light" w:cs="Arial Unicode MS" w:hint="eastAsia"/>
+        </w:rPr>
+        <w:t xml:space="preserve"> 서비스로 구성된다.</w:t>
+      </w:r>
+    </w:p>
+    <w:p>
+      <w:pPr>
+        <w:pBdr>
+          <w:top w:val="nil"/>
+          <w:left w:val="nil"/>
+          <w:bottom w:val="nil"/>
+          <w:right w:val="nil"/>
+          <w:between w:val="nil"/>
+        </w:pBdr>
+        <w:spacing w:after="240"/>
+        <w:ind w:firstLineChars="100" w:firstLine="198"/>
+        <w:rPr>
+          <w:rFonts w:ascii="KoPub돋움체 Light" w:eastAsia="KoPub돋움체 Light" w:hAnsi="KoPub돋움체 Light"/>
+        </w:rPr>
+      </w:pPr>
+      <w:r>
+        <w:rPr>
+          <w:rFonts w:ascii="KoPub돋움체 Light" w:eastAsia="KoPub돋움체 Light" w:hAnsi="KoPub돋움체 Light" w:cs="Arial Unicode MS"/>
+        </w:rPr>
+        <w:t xml:space="preserve">클라이언트는 인증 절차를 거쳐 JWT와 일회용 난수를 차례로 수신한다. 이후 HTTP 요청 컨텍스트를 </w:t>
+      </w:r>
+      <w:proofErr w:type="spellStart"/>
+      <w:r>
+        <w:rPr>
+          <w:rFonts w:ascii="KoPub돋움체 Light" w:eastAsia="KoPub돋움체 Light" w:hAnsi="KoPub돋움체 Light" w:cs="Arial Unicode MS"/>
+        </w:rPr>
+        <w:t>직렬화하여</w:t>
+      </w:r>
+      <w:proofErr w:type="spellEnd"/>
+      <w:r>
+        <w:rPr>
+          <w:rFonts w:ascii="KoPub돋움체 Light" w:eastAsia="KoPub돋움체 Light" w:hAnsi="KoPub돋움체 Light" w:cs="Arial Unicode MS"/>
+        </w:rPr>
+        <w:t xml:space="preserve"> 하드웨어 칩셋에 전달하고, 내부 논리회로에서 생성된 디지털 서명을 수신하여 요청 헤더에 첨부한다. 게이트웨이는 인입된 패킷을 검증한 뒤 유효한 요청에 한하여 </w:t>
+      </w:r>
+      <w:proofErr w:type="spellStart"/>
+      <w:r>
+        <w:rPr>
+          <w:rFonts w:ascii="KoPub돋움체 Light" w:eastAsia="KoPub돋움체 Light" w:hAnsi="KoPub돋움체 Light" w:cs="Arial Unicode MS"/>
+        </w:rPr>
+        <w:t>업스트림</w:t>
+      </w:r>
+      <w:proofErr w:type="spellEnd"/>
+      <w:r>
+        <w:rPr>
+          <w:rFonts w:ascii="KoPub돋움체 Light" w:eastAsia="KoPub돋움체 Light" w:hAnsi="KoPub돋움체 Light" w:cs="Arial Unicode MS"/>
+        </w:rPr>
+        <w:t xml:space="preserve"> 서비스로 중계한다.</w:t>
+      </w:r>
+    </w:p>
+    <w:p>
+      <w:pPr>
+        <w:pBdr>
+          <w:top w:val="nil"/>
+          <w:left w:val="nil"/>
+          <w:bottom w:val="nil"/>
+          <w:right w:val="nil"/>
+          <w:between w:val="nil"/>
+        </w:pBdr>
+        <w:spacing w:after="240"/>
+        <w:rPr>
+          <w:rFonts w:ascii="KoPub돋움체 Light" w:eastAsia="KoPub돋움체 Light" w:hAnsi="KoPub돋움체 Light" w:hint="eastAsia"/>
         </w:rPr>
       </w:pPr>
     </w:p>
@@ -2339,8 +2357,8 @@
           <w:rFonts w:ascii="KoPub돋움체 Light" w:eastAsia="KoPub돋움체 Light" w:hAnsi="KoPub돋움체 Light" w:cs="Arial Unicode MS"/>
         </w:rPr>
       </w:pPr>
-      <w:bookmarkStart w:id="13" w:name="_up9dm7u1mhhk" w:colFirst="0" w:colLast="0"/>
-      <w:bookmarkEnd w:id="13"/>
+      <w:bookmarkStart w:id="11" w:name="_up9dm7u1mhhk" w:colFirst="0" w:colLast="0"/>
+      <w:bookmarkEnd w:id="11"/>
       <w:r>
         <w:rPr>
           <w:rFonts w:ascii="KoPub돋움체 Light" w:eastAsia="KoPub돋움체 Light" w:hAnsi="KoPub돋움체 Light" w:cs="Arial Unicode MS"/>
@@ -2546,13 +2564,12 @@
           <w:rFonts w:ascii="KoPub돋움체 Light" w:eastAsia="KoPub돋움체 Light" w:hAnsi="KoPub돋움체 Light" w:cs="Arial Unicode MS"/>
         </w:rPr>
       </w:pPr>
-      <w:bookmarkStart w:id="14" w:name="_5avjbhh4zbwf" w:colFirst="0" w:colLast="0"/>
-      <w:bookmarkEnd w:id="14"/>
-      <w:r>
-        <w:rPr>
-          <w:rFonts w:ascii="KoPub돋움체 Light" w:eastAsia="KoPub돋움체 Light" w:hAnsi="KoPub돋움체 Light" w:cs="Arial Unicode MS"/>
-        </w:rPr>
-        <w:lastRenderedPageBreak/>
+      <w:bookmarkStart w:id="12" w:name="_5avjbhh4zbwf" w:colFirst="0" w:colLast="0"/>
+      <w:bookmarkEnd w:id="12"/>
+      <w:r>
+        <w:rPr>
+          <w:rFonts w:ascii="KoPub돋움체 Light" w:eastAsia="KoPub돋움체 Light" w:hAnsi="KoPub돋움체 Light" w:cs="Arial Unicode MS"/>
+        </w:rPr>
         <w:t>3. Fast-Fail 단축 검증 파이프라인</w:t>
       </w:r>
     </w:p>
@@ -2731,6 +2748,7 @@
         <w:rPr>
           <w:rFonts w:ascii="KoPub돋움체 Light" w:eastAsia="KoPub돋움체 Light" w:hAnsi="KoPub돋움체 Light" w:cs="Arial Unicode MS"/>
         </w:rPr>
+        <w:lastRenderedPageBreak/>
         <w:t xml:space="preserve">본문 다이제스트 비교: 수신한 본문의 스트리밍 </w:t>
       </w:r>
       <w:proofErr w:type="spellStart"/>
@@ -2844,8 +2862,8 @@
           <w:rFonts w:ascii="KoPub돋움체 Light" w:eastAsia="KoPub돋움체 Light" w:hAnsi="KoPub돋움체 Light" w:cs="Arial Unicode MS"/>
         </w:rPr>
       </w:pPr>
-      <w:bookmarkStart w:id="15" w:name="_v94i3b7wwy08" w:colFirst="0" w:colLast="0"/>
-      <w:bookmarkEnd w:id="15"/>
+      <w:bookmarkStart w:id="13" w:name="_v94i3b7wwy08" w:colFirst="0" w:colLast="0"/>
+      <w:bookmarkEnd w:id="13"/>
       <w:r>
         <w:rPr>
           <w:rFonts w:ascii="KoPub돋움체 Light" w:eastAsia="KoPub돋움체 Light" w:hAnsi="KoPub돋움체 Light" w:cs="Arial Unicode MS"/>
@@ -3070,8 +3088,8 @@
           <w:rFonts w:ascii="KoPub돋움체 Light" w:eastAsia="KoPub돋움체 Light" w:hAnsi="KoPub돋움체 Light"/>
         </w:rPr>
       </w:pPr>
-      <w:bookmarkStart w:id="16" w:name="_njnl9ow0ezn7" w:colFirst="0" w:colLast="0"/>
-      <w:bookmarkEnd w:id="16"/>
+      <w:bookmarkStart w:id="14" w:name="_njnl9ow0ezn7" w:colFirst="0" w:colLast="0"/>
+      <w:bookmarkEnd w:id="14"/>
       <w:r>
         <w:rPr>
           <w:rFonts w:ascii="KoPub돋움체 Light" w:eastAsia="KoPub돋움체 Light" w:hAnsi="KoPub돋움체 Light" w:cs="Arial Unicode MS"/>
@@ -3087,8 +3105,8 @@
           <w:rFonts w:ascii="KoPub돋움체 Light" w:eastAsia="KoPub돋움체 Light" w:hAnsi="KoPub돋움체 Light" w:cs="Arial Unicode MS"/>
         </w:rPr>
       </w:pPr>
-      <w:bookmarkStart w:id="17" w:name="_g2ddme6wb2pp" w:colFirst="0" w:colLast="0"/>
-      <w:bookmarkEnd w:id="17"/>
+      <w:bookmarkStart w:id="15" w:name="_g2ddme6wb2pp" w:colFirst="0" w:colLast="0"/>
+      <w:bookmarkEnd w:id="15"/>
       <w:r>
         <w:rPr>
           <w:rFonts w:ascii="KoPub돋움체 Light" w:eastAsia="KoPub돋움체 Light" w:hAnsi="KoPub돋움체 Light" w:cs="Arial Unicode MS"/>
@@ -3144,14 +3162,7 @@
         <w:rPr>
           <w:rFonts w:ascii="KoPub돋움체 Light" w:eastAsia="KoPub돋움체 Light" w:hAnsi="KoPub돋움체 Light" w:cs="Arial Unicode MS"/>
         </w:rPr>
-        <w:t xml:space="preserve"> 프레임워크 기반으로 프로토타입 시스템을 구축하였다. 게이트웨이는 비동기 I/O 이벤트 루프 </w:t>
-      </w:r>
-      <w:r>
-        <w:rPr>
-          <w:rFonts w:ascii="KoPub돋움체 Light" w:eastAsia="KoPub돋움체 Light" w:hAnsi="KoPub돋움체 Light" w:cs="Arial Unicode MS"/>
-        </w:rPr>
-        <w:lastRenderedPageBreak/>
-        <w:t xml:space="preserve">상에서 구동하고, </w:t>
+        <w:t xml:space="preserve"> 프레임워크 기반으로 프로토타입 시스템을 구축하였다. 게이트웨이는 비동기 I/O 이벤트 루프 상에서 구동하고, </w:t>
       </w:r>
       <w:proofErr w:type="spellStart"/>
       <w:r>
@@ -3284,8 +3295,8 @@
           <w:rFonts w:ascii="KoPub돋움체 Light" w:eastAsia="KoPub돋움체 Light" w:hAnsi="KoPub돋움체 Light" w:cs="Arial Unicode MS"/>
         </w:rPr>
       </w:pPr>
-      <w:bookmarkStart w:id="18" w:name="_azxkgudv4bhh" w:colFirst="0" w:colLast="0"/>
-      <w:bookmarkEnd w:id="18"/>
+      <w:bookmarkStart w:id="16" w:name="_azxkgudv4bhh" w:colFirst="0" w:colLast="0"/>
+      <w:bookmarkEnd w:id="16"/>
       <w:r>
         <w:rPr>
           <w:rFonts w:ascii="KoPub돋움체 Light" w:eastAsia="KoPub돋움체 Light" w:hAnsi="KoPub돋움체 Light" w:cs="Arial Unicode MS"/>
@@ -4247,13 +4258,12 @@
           <w:rFonts w:ascii="KoPub돋움체 Light" w:eastAsia="KoPub돋움체 Light" w:hAnsi="KoPub돋움체 Light" w:cs="Arial Unicode MS"/>
         </w:rPr>
       </w:pPr>
-      <w:bookmarkStart w:id="19" w:name="_4km7hngf7ioy" w:colFirst="0" w:colLast="0"/>
-      <w:bookmarkEnd w:id="19"/>
-      <w:r>
-        <w:rPr>
-          <w:rFonts w:ascii="KoPub돋움체 Light" w:eastAsia="KoPub돋움체 Light" w:hAnsi="KoPub돋움체 Light" w:cs="Arial Unicode MS"/>
-        </w:rPr>
-        <w:lastRenderedPageBreak/>
+      <w:bookmarkStart w:id="17" w:name="_4km7hngf7ioy" w:colFirst="0" w:colLast="0"/>
+      <w:bookmarkEnd w:id="17"/>
+      <w:r>
+        <w:rPr>
+          <w:rFonts w:ascii="KoPub돋움체 Light" w:eastAsia="KoPub돋움체 Light" w:hAnsi="KoPub돋움체 Light" w:cs="Arial Unicode MS"/>
+        </w:rPr>
         <w:t xml:space="preserve">3. </w:t>
       </w:r>
       <w:proofErr w:type="spellStart"/>
@@ -4383,19 +4393,13 @@
           <w:rFonts w:ascii="KoPub돋움체 Light" w:eastAsia="KoPub돋움체 Light" w:hAnsi="KoPub돋움체 Light" w:cs="Arial Unicode MS"/>
         </w:rPr>
       </w:pPr>
-      <w:bookmarkStart w:id="20" w:name="_5zfolbo50wfm" w:colFirst="0" w:colLast="0"/>
-      <w:bookmarkEnd w:id="20"/>
+      <w:bookmarkStart w:id="18" w:name="_5zfolbo50wfm" w:colFirst="0" w:colLast="0"/>
+      <w:bookmarkEnd w:id="18"/>
       <w:r>
         <w:rPr>
           <w:rFonts w:ascii="KoPub돋움체 Light" w:eastAsia="KoPub돋움체 Light" w:hAnsi="KoPub돋움체 Light" w:cs="Arial Unicode MS"/>
         </w:rPr>
         <w:t>4. 처리 지연시간 및 페이로드 오버헤드 실측</w:t>
-      </w:r>
-      <w:r>
-        <w:rPr>
-          <w:rFonts w:ascii="KoPub돋움체 Light" w:eastAsia="KoPub돋움체 Light" w:hAnsi="KoPub돋움체 Light" w:cs="Arial Unicode MS"/>
-        </w:rPr>
-        <w:br/>
       </w:r>
     </w:p>
     <w:p>
@@ -5557,7 +5561,6 @@
         <w:rPr>
           <w:rFonts w:ascii="KoPub돋움체 Light" w:eastAsia="KoPub돋움체 Light" w:hAnsi="KoPub돋움체 Light"/>
         </w:rPr>
-        <w:lastRenderedPageBreak/>
         <w:t>페이로드 측면에서는 모드 B가 256 Bytes의 고정 서명 크기와 Base64 인코딩 팽창으로 인해 499 Bytes의 헤더 오버헤드를 발생시킨 반면, 모드 C는 64 Bytes의 서명 좌표 구조를 통해 오버헤드를 252 Bytes로 억제하였다. 이는 RSA 대비 50 %의 페이로드를 절감함을 확인하였다.</w:t>
       </w:r>
     </w:p>
@@ -5576,8 +5579,8 @@
           <w:rFonts w:ascii="KoPub돋움체 Light" w:eastAsia="KoPub돋움체 Light" w:hAnsi="KoPub돋움체 Light" w:cs="Arial Unicode MS"/>
         </w:rPr>
       </w:pPr>
-      <w:bookmarkStart w:id="21" w:name="_ulmb3id0vc9j" w:colFirst="0" w:colLast="0"/>
-      <w:bookmarkEnd w:id="21"/>
+      <w:bookmarkStart w:id="19" w:name="_ulmb3id0vc9j" w:colFirst="0" w:colLast="0"/>
+      <w:bookmarkEnd w:id="19"/>
       <w:r>
         <w:rPr>
           <w:rFonts w:ascii="KoPub돋움체 Light" w:eastAsia="KoPub돋움체 Light" w:hAnsi="KoPub돋움체 Light" w:cs="Arial Unicode MS"/>
@@ -6464,8 +6467,8 @@
           <w:rFonts w:ascii="KoPub돋움체 Light" w:eastAsia="KoPub돋움체 Light" w:hAnsi="KoPub돋움체 Light"/>
         </w:rPr>
       </w:pPr>
-      <w:bookmarkStart w:id="22" w:name="_4qc1494znfja" w:colFirst="0" w:colLast="0"/>
-      <w:bookmarkEnd w:id="22"/>
+      <w:bookmarkStart w:id="20" w:name="_4qc1494znfja" w:colFirst="0" w:colLast="0"/>
+      <w:bookmarkEnd w:id="20"/>
       <w:r>
         <w:rPr>
           <w:rFonts w:ascii="KoPub돋움체 Light" w:eastAsia="KoPub돋움체 Light" w:hAnsi="KoPub돋움체 Light" w:cs="Arial Unicode MS"/>
@@ -6493,8 +6496,8 @@
           <w:rFonts w:ascii="KoPub돋움체 Light" w:eastAsia="KoPub돋움체 Light" w:hAnsi="KoPub돋움체 Light" w:cs="Arial Unicode MS"/>
         </w:rPr>
       </w:pPr>
-      <w:bookmarkStart w:id="23" w:name="_rl1d1rilxzpy" w:colFirst="0" w:colLast="0"/>
-      <w:bookmarkEnd w:id="23"/>
+      <w:bookmarkStart w:id="21" w:name="_rl1d1rilxzpy" w:colFirst="0" w:colLast="0"/>
+      <w:bookmarkEnd w:id="21"/>
       <w:r>
         <w:rPr>
           <w:rFonts w:ascii="KoPub돋움체 Light" w:eastAsia="KoPub돋움체 Light" w:hAnsi="KoPub돋움체 Light" w:cs="Arial Unicode MS"/>
@@ -6549,6 +6552,7 @@
         <w:rPr>
           <w:rFonts w:ascii="KoPub돋움체 Light" w:eastAsia="KoPub돋움체 Light" w:hAnsi="KoPub돋움체 Light"/>
         </w:rPr>
+        <w:lastRenderedPageBreak/>
         <w:t>시스템의 핵심 기여와 실증 결과는 다음과 같다.</w:t>
       </w:r>
     </w:p>
@@ -6743,8 +6747,8 @@
           <w:rFonts w:ascii="KoPub돋움체 Light" w:eastAsia="KoPub돋움체 Light" w:hAnsi="KoPub돋움체 Light" w:cs="Arial Unicode MS"/>
         </w:rPr>
       </w:pPr>
-      <w:bookmarkStart w:id="24" w:name="_1mss8opdw1ki" w:colFirst="0" w:colLast="0"/>
-      <w:bookmarkEnd w:id="24"/>
+      <w:bookmarkStart w:id="22" w:name="_1mss8opdw1ki" w:colFirst="0" w:colLast="0"/>
+      <w:bookmarkEnd w:id="22"/>
       <w:r>
         <w:rPr>
           <w:rFonts w:ascii="KoPub돋움체 Light" w:eastAsia="KoPub돋움체 Light" w:hAnsi="KoPub돋움체 Light" w:cs="Arial Unicode MS"/>
@@ -6918,13 +6922,12 @@
           <w:rFonts w:ascii="KoPub돋움체 Light" w:eastAsia="KoPub돋움체 Light" w:hAnsi="KoPub돋움체 Light" w:cs="Arial Unicode MS"/>
         </w:rPr>
       </w:pPr>
-      <w:bookmarkStart w:id="25" w:name="_r8s6lsya6m6s" w:colFirst="0" w:colLast="0"/>
-      <w:bookmarkEnd w:id="25"/>
-      <w:r>
-        <w:rPr>
-          <w:rFonts w:ascii="KoPub돋움체 Light" w:eastAsia="KoPub돋움체 Light" w:hAnsi="KoPub돋움체 Light" w:cs="Arial Unicode MS"/>
-        </w:rPr>
-        <w:lastRenderedPageBreak/>
+      <w:bookmarkStart w:id="23" w:name="_r8s6lsya6m6s" w:colFirst="0" w:colLast="0"/>
+      <w:bookmarkEnd w:id="23"/>
+      <w:r>
+        <w:rPr>
+          <w:rFonts w:ascii="KoPub돋움체 Light" w:eastAsia="KoPub돋움체 Light" w:hAnsi="KoPub돋움체 Light" w:cs="Arial Unicode MS"/>
+        </w:rPr>
         <w:t>3. 향후 연구 과제</w:t>
       </w:r>
     </w:p>
@@ -7083,8 +7086,8 @@
         </w:rPr>
         <w:t>하드웨어 칩셋에서 생성된 공개키를 게이트웨이에 안전하게 사전 등록하는 인가 프로토콜과 암호화 키 만료 또는 단말 분실 시 기존 키 쌍을 즉시 폐기하고 갱신하는 라이프사이클 관리 정책을 설계한다.</w:t>
       </w:r>
-      <w:bookmarkStart w:id="26" w:name="_5buas6vim83" w:colFirst="0" w:colLast="0"/>
-      <w:bookmarkEnd w:id="26"/>
+      <w:bookmarkStart w:id="24" w:name="_5buas6vim83" w:colFirst="0" w:colLast="0"/>
+      <w:bookmarkEnd w:id="24"/>
     </w:p>
     <w:p>
       <w:pPr>
@@ -7535,10 +7538,12 @@
       </w:r>
     </w:p>
     <w:sectPr>
+      <w:footerReference w:type="default" r:id="rId8"/>
       <w:pgSz w:w="12240" w:h="15840"/>
-      <w:pgMar w:top="1440" w:right="1440" w:bottom="1440" w:left="1440" w:header="0" w:footer="720" w:gutter="0"/>
-      <w:pgNumType w:start="1"/>
+      <w:pgMar w:top="1701" w:right="1440" w:bottom="1440" w:left="1440" w:header="0" w:footer="720" w:gutter="0"/>
+      <w:pgNumType w:start="1" w:chapStyle="1"/>
       <w:cols w:space="720"/>
+      <w:docGrid w:linePitch="299"/>
     </w:sectPr>
   </w:body>
 </w:document>
@@ -7561,6 +7566,51 @@
     </w:p>
   </w:endnote>
 </w:endnotes>
+</file>
+
+<file path=word/footer1.xml><?xml version="1.0" encoding="utf-8"?>
+<w:ftr xmlns:wpc="http://schemas.microsoft.com/office/word/2010/wordprocessingCanvas" xmlns:cx="http://schemas.microsoft.com/office/drawing/2014/chartex" xmlns:cx1="http://schemas.microsoft.com/office/drawing/2015/9/8/chartex" xmlns:cx2="http://schemas.microsoft.com/office/drawing/2015/10/21/chartex" xmlns:cx3="http://schemas.microsoft.com/office/drawing/2016/5/9/chartex" xmlns:cx4="http://schemas.microsoft.com/office/drawing/2016/5/10/chartex" xmlns:cx5="http://schemas.microsoft.com/office/drawing/2016/5/11/chartex" xmlns:cx6="http://schemas.microsoft.com/office/drawing/2016/5/12/chartex" xmlns:cx7="http://schemas.microsoft.com/office/drawing/2016/5/13/chartex" xmlns:cx8="http://schemas.microsoft.com/office/drawing/2016/5/14/chartex" xmlns:mc="http://schemas.openxmlformats.org/markup-compatibility/2006" xmlns:aink="http://schemas.microsoft.com/office/drawing/2016/ink" xmlns:am3d="http://schemas.microsoft.com/office/drawing/2017/model3d" xmlns:o="urn:schemas-microsoft-com:office:office" xmlns:oel="http://schemas.microsoft.com/office/2019/extlst" xmlns:r="http://schemas.openxmlformats.org/officeDocument/2006/relationships" xmlns:m="http://schemas.openxmlformats.org/officeDocument/2006/math" xmlns:v="urn:schemas-microsoft-com:vml" xmlns:wp14="http://schemas.microsoft.com/office/word/2010/wordprocessingDrawing" xmlns:wp="http://schemas.openxmlformats.org/drawingml/2006/wordprocessingDrawing" xmlns:w10="urn:schemas-microsoft-com:office:word" xmlns:w="http://schemas.openxmlformats.org/wordprocessingml/2006/main" xmlns:w14="http://schemas.microsoft.com/office/word/2010/wordml" xmlns:w15="http://schemas.microsoft.com/office/word/2012/wordml" xmlns:w16cex="http://schemas.microsoft.com/office/word/2018/wordml/cex" xmlns:w16cid="http://schemas.microsoft.com/office/word/2016/wordml/cid" xmlns:w16="http://schemas.microsoft.com/office/word/2018/wordml" xmlns:w16du="http://schemas.microsoft.com/office/word/2023/wordml/word16du" xmlns:w16sdtdh="http://schemas.microsoft.com/office/word/2020/wordml/sdtdatahash" xmlns:w16sdtfl="http://schemas.microsoft.com/office/word/2024/wordml/sdtformatlock" xmlns:w16se="http://schemas.microsoft.com/office/word/2015/wordml/symex" xmlns:wpg="http://schemas.microsoft.com/office/word/2010/wordprocessingGroup" xmlns:wpi="http://schemas.microsoft.com/office/word/2010/wordprocessingInk" xmlns:wne="http://schemas.microsoft.com/office/word/2006/wordml" xmlns:wps="http://schemas.microsoft.com/office/word/2010/wordprocessingShape" mc:Ignorable="w14 w15 w16se w16cid w16 w16cex w16sdtdh w16sdtfl w16du wp14">
+  <w:sdt>
+    <w:sdtPr>
+      <w:id w:val="849448073"/>
+      <w:docPartObj>
+        <w:docPartGallery w:val="Page Numbers (Bottom of Page)"/>
+        <w:docPartUnique/>
+      </w:docPartObj>
+    </w:sdtPr>
+    <w:sdtContent>
+      <w:p>
+        <w:pPr>
+          <w:pStyle w:val="ab"/>
+          <w:jc w:val="center"/>
+        </w:pPr>
+        <w:r>
+          <w:fldChar w:fldCharType="begin"/>
+        </w:r>
+        <w:r>
+          <w:instrText>PAGE   \* MERGEFORMAT</w:instrText>
+        </w:r>
+        <w:r>
+          <w:fldChar w:fldCharType="separate"/>
+        </w:r>
+        <w:r>
+          <w:rPr>
+            <w:lang w:val="ko-KR"/>
+          </w:rPr>
+          <w:t>2</w:t>
+        </w:r>
+        <w:r>
+          <w:fldChar w:fldCharType="end"/>
+        </w:r>
+      </w:p>
+    </w:sdtContent>
+  </w:sdt>
+  <w:p>
+    <w:pPr>
+      <w:pStyle w:val="ab"/>
+    </w:pPr>
+  </w:p>
+</w:ftr>
 </file>
 
 <file path=word/footnotes.xml><?xml version="1.0" encoding="utf-8"?>

</xml_diff>